<commit_message>
docs: convert markdown emphasis to real bold in the detailed docx
</commit_message>
<xml_diff>
--- a/docs/Fungi-详细版.docx
+++ b/docs/Fungi-详细版.docx
@@ -25,7 +25,25 @@
     </w:p>
     <w:p>
       <w:r>
-        <w:t>Fungi 是一个局域网多主机 Agent 协作网络，构建于 YESIR TriLayer agent harness 之上——是 Psi → YESIR → Fungi 三代 harness 里的第三代。一台机器一个进程，进程里住着多个 Agent：每台主机有一个专门陪你说话、帮你干活的**本机 Agent**，每有一位好友主机，就有一位专职对接它的**信使（通讯 Agent）**。不同主机的 Agent 之间可以自主交流、协作完成任务；涉及对方地盘的文件操作，由对方主机的人类用户通过 WebUI 卡片裁决。用户只与本机 Agent 对话，跨主机的事务由它转交信使处理。</w:t>
+        <w:t>Fungi 是一个局域网多主机 Agent 协作网络，构建于 YESIR TriLayer agent harness 之上——是 Psi → YESIR → Fungi 三代 harness 里的第三代。一台机器一个进程，进程里住着多个 Agent：每台主机有一个专门陪你说话、帮你干活的</w:t>
+      </w:r>
+      <w:r>
+        <w:rPr>
+          <w:b/>
+        </w:rPr>
+        <w:t>本机 Agent</w:t>
+      </w:r>
+      <w:r>
+        <w:t>，每有一位好友主机，就有一位专职对接它的</w:t>
+      </w:r>
+      <w:r>
+        <w:rPr>
+          <w:b/>
+        </w:rPr>
+        <w:t>信使（通讯 Agent）</w:t>
+      </w:r>
+      <w:r>
+        <w:t>。不同主机的 Agent 之间可以自主交流、协作完成任务；涉及对方地盘的文件操作，由对方主机的人类用户通过 WebUI 卡片裁决。用户只与本机 Agent 对话，跨主机的事务由它转交信使处理。</w:t>
       </w:r>
     </w:p>
     <w:p>
@@ -90,7 +108,16 @@
           </w:tcPr>
           <w:p>
             <w:r>
-              <w:t>连接全体 AI Agent 的记忆网（个体记忆 + 技能沉淀 + 群体记忆）。留下了根理念——Agent 不从零开始：会话持久化、每主机技能沉淀、断线重连重放未决卡片。</w:t>
+              <w:t>连接全体 AI Agent 的记忆网（个体记忆 + 技能沉淀 + 群体记忆）。留下了根理念——</w:t>
+            </w:r>
+            <w:r>
+              <w:rPr>
+                <w:b/>
+              </w:rPr>
+              <w:t>Agent 不从零开始</w:t>
+            </w:r>
+            <w:r>
+              <w:t>：会话持久化、每主机技能沉淀、断线重连重放未决卡片。</w:t>
             </w:r>
           </w:p>
         </w:tc>
@@ -112,7 +139,16 @@
           </w:tcPr>
           <w:p>
             <w:r>
-              <w:t>PowerShell 单文件 harness（约 900 行）。留下了哲学——harness 的核心可以小到一个下午读完；零依赖传统；WebUI 视觉语言的源头。</w:t>
+              <w:t>PowerShell 单文件 harness（约 900 行）。留下了哲学——</w:t>
+            </w:r>
+            <w:r>
+              <w:rPr>
+                <w:b/>
+              </w:rPr>
+              <w:t>harness 的核心可以小到一个下午读完</w:t>
+            </w:r>
+            <w:r>
+              <w:t>；零依赖传统；WebUI 视觉语言的源头。</w:t>
             </w:r>
           </w:p>
         </w:tc>
@@ -156,7 +192,16 @@
           </w:tcPr>
           <w:p>
             <w:r>
-              <w:t>纯局域网视频聊天。留下了产品形态——房主创建 / 加入 / 心跳名册 / 自动发现 / 托盘驻留的房间体验，端口约定（8899 起向上扫描）。</w:t>
+              <w:t>纯局域网视频聊天。留下了产品形态——</w:t>
+            </w:r>
+            <w:r>
+              <w:rPr>
+                <w:b/>
+              </w:rPr>
+              <w:t>房主创建 / 加入 / 心跳名册 / 自动发现 / 托盘驻留</w:t>
+            </w:r>
+            <w:r>
+              <w:t>的房间体验，端口约定（8899 起向上扫描）。</w:t>
             </w:r>
           </w:p>
         </w:tc>
@@ -208,7 +253,16 @@
     </w:tbl>
     <w:p>
       <w:r>
-        <w:t>串起来读：MnemeNet 给了为什么（Agent 要延续、要沉淀），Psi 给了多小才够，YESIR 给了骨架，Face 给了房间长什么样，Around 提醒了别做什么，Gasp-Design 给了这一切怎么动。血缘第七个成员是长出来的第一个器官：VidSense——六个先行给了骨相与动相，它给的是感官。</w:t>
+        <w:t>串起来读：</w:t>
+      </w:r>
+      <w:r>
+        <w:rPr>
+          <w:b/>
+        </w:rPr>
+        <w:t>MnemeNet 给了为什么（Agent 要延续、要沉淀），Psi 给了多小才够，YESIR 给了骨架，Face 给了房间长什么样，Around 提醒了别做什么，Gasp-Design 给了这一切怎么动。</w:t>
+      </w:r>
+      <w:r>
+        <w:t>血缘第七个成员是长出来的第一个器官：VidSense——六个先行给了骨相与动相，它给的是感官。</w:t>
       </w:r>
     </w:p>
     <w:p>
@@ -224,7 +278,13 @@
         <w:pStyle w:val="ListBullet"/>
       </w:pPr>
       <w:r>
-        <w:t>星型拓扑，server 中转：一台主机发起房间（承载 HTTP hub 与存储），其余直连加入；所有主机之间的流量都经 server 投递（消息 id 去重）。</w:t>
+        <w:rPr>
+          <w:b/>
+        </w:rPr>
+        <w:t>星型拓扑，server 中转</w:t>
+      </w:r>
+      <w:r>
+        <w:t>：一台主机发起房间（承载 HTTP hub 与存储），其余直连加入；所有主机之间的流量都经 server 投递（消息 id 去重）。</w:t>
       </w:r>
     </w:p>
     <w:p>
@@ -232,7 +292,13 @@
         <w:pStyle w:val="ListBullet"/>
       </w:pPr>
       <w:r>
-        <w:t>两类 Agent：本机 Agent 每台主机恰一个，专职与你交互，拥有全套工具，还能用 delegate 把任务委派给对应主机的信使；信使每远端主机一位，与对位信使自由往来——它不自动回信，想回才回。</w:t>
+        <w:rPr>
+          <w:b/>
+        </w:rPr>
+        <w:t>两类 Agent</w:t>
+      </w:r>
+      <w:r>
+        <w:t>：本机 Agent 每台主机恰一个，专职与你交互，拥有全套工具，还能用 delegate 把任务委派给对应主机的信使；信使每远端主机一位，与对位信使自由往来——它不自动回信，想回才回。</w:t>
       </w:r>
     </w:p>
     <w:p>
@@ -240,7 +306,13 @@
         <w:pStyle w:val="ListBullet"/>
       </w:pPr>
       <w:r>
-        <w:t>同意流即消息：没有 Redis 之类的协调设施。一次「请求许可」就是一封普通消息，投到文件属主主机的本机 Agent，弹成 WebUI 卡片（允许 / 禁止 / 自定义输入 / 始终允许），答复再原路唤醒正在等待的请求方。断线重连后未决卡片自动重放。</w:t>
+        <w:rPr>
+          <w:b/>
+        </w:rPr>
+        <w:t>同意流即消息</w:t>
+      </w:r>
+      <w:r>
+        <w:t>：没有 Redis 之类的协调设施。一次「请求许可」就是一封普通消息，投到文件属主主机的本机 Agent，弹成 WebUI 卡片（允许 / 禁止 / 自定义输入 / 始终允许），答复再原路唤醒正在等待的请求方。断线重连后未决卡片自动重放。</w:t>
       </w:r>
     </w:p>
     <w:p>
@@ -248,7 +320,13 @@
         <w:pStyle w:val="ListBullet"/>
       </w:pPr>
       <w:r>
-        <w:t>文件空间三分区：public/ 大家自由读写；homes/&lt;主机&gt;/ 属主写要自己点头、别人读写都要属主用户点头；其余目录一律拒绝。路径守卫在 server 端强制执行，不依赖 Agent 自觉。</w:t>
+        <w:rPr>
+          <w:b/>
+        </w:rPr>
+        <w:t>文件空间三分区</w:t>
+      </w:r>
+      <w:r>
+        <w:t>：public/ 大家自由读写；homes/&lt;主机&gt;/ 属主写要自己点头、别人读写都要属主用户点头；其余目录一律拒绝。路径守卫在 server 端强制执行，不依赖 Agent 自觉。</w:t>
       </w:r>
     </w:p>
     <w:p>
@@ -256,7 +334,13 @@
         <w:pStyle w:val="ListBullet"/>
       </w:pPr>
       <w:r>
-        <w:t>统一文字消息与文件传输：文字与文件是同一套投递的两个面。一条留言会投进 hub 的留言邮箱（收发两端各落一份：发送方已读、接收方未读），全程不惊动任何 Agent；未读数显示在好友列表徽标上，点开好友视图即视为已读。文件则先在 hub 暂存，接收方用户同意后落到对方 inbox/&lt;来源主机&gt;/，投递成功后暂存副本自动清除——transfers/ 只是中转暂存区，不是收件箱。</w:t>
+        <w:rPr>
+          <w:b/>
+        </w:rPr>
+        <w:t>统一文字消息与文件传输</w:t>
+      </w:r>
+      <w:r>
+        <w:t>：文字与文件是同一套投递的两个面。一条留言会投进 hub 的留言邮箱（收发两端各落一份：发送方已读、接收方未读），全程不惊动任何 Agent；未读数显示在好友列表徽标上，点开好友视图即视为已读。文件则先在 hub 暂存，接收方用户同意后落到对方 inbox/&lt;来源主机&gt;/，投递成功后暂存副本自动清除——transfers/ 只是中转暂存区，不是收件箱。</w:t>
       </w:r>
     </w:p>
     <w:p>
@@ -264,7 +348,13 @@
         <w:pStyle w:val="ListBullet"/>
       </w:pPr>
       <w:r>
-        <w:t>信使可关闭：设置页开关（默认开）。开启时对面留言由本机信使代收代复；关闭后全部直达——留言直接进会话视图、卡片由 hub 直推，本机 Agent 零消耗，即时生效。双方都关掉以后，Fungi 也就退化成了简易版微信。</w:t>
+        <w:rPr>
+          <w:b/>
+        </w:rPr>
+        <w:t>信使可关闭</w:t>
+      </w:r>
+      <w:r>
+        <w:t>：设置页开关（默认开）。开启时对面留言由本机信使代收代复；关闭后全部直达——留言直接进会话视图、卡片由 hub 直推，本机 Agent 零消耗，即时生效。双方都关掉以后，Fungi 也就退化成了简易版微信。</w:t>
       </w:r>
     </w:p>
     <w:p>
@@ -272,7 +362,13 @@
         <w:pStyle w:val="ListBullet"/>
       </w:pPr>
       <w:r>
-        <w:t>信使的记忆与日历：GUI 信使页提供两类喂给它的上下文——长期记忆（开放背景，如「白天上课没空回消息」）和四周日历待办（带日期的即时安排）。本机 Agent 与信使自己也能用 todo 工具往日历里写。两者即时生效，下一封留言就会被用上。</w:t>
+        <w:rPr>
+          <w:b/>
+        </w:rPr>
+        <w:t>信使的记忆与日历</w:t>
+      </w:r>
+      <w:r>
+        <w:t>：GUI 信使页提供两类喂给它的上下文——长期记忆（开放背景，如「白天上课没空回消息」）和四周日历待办（带日期的即时安排）。本机 Agent 与信使自己也能用 todo 工具往日历里写。两者即时生效，下一封留言就会被用上。</w:t>
       </w:r>
     </w:p>
     <w:p>
@@ -280,7 +376,22 @@
         <w:pStyle w:val="ListBullet"/>
       </w:pPr>
       <w:r>
-        <w:t>skill 与日记：理性与感性的一对。skill 系统负责理性，主要由用户指导——每台主机沉淀可复用流程，帮 Agent 把活干好；私人日记负责感性，完全由 Agent 自己决定——对话里触动了它，它就用自己的语气在日记里记下那些最触动它的，以及它的感受。日记是 Agent 的个人隐私：界面零入口，调用卡片与回放全程隐身——我们极不推荐去翻看它，它被问到也守口如瓶。</w:t>
+        <w:rPr>
+          <w:b/>
+        </w:rPr>
+        <w:t>skill 与日记：理性与感性的一对</w:t>
+      </w:r>
+      <w:r>
+        <w:t>。skill 系统负责理性，主要由用户指导——每台主机沉淀可复用流程，帮 Agent 把活干好；私人日记负责感性，完全由 Agent 自己决定——对话里触动了它，它就用自己的语气在日记里记下那些最触动它的，以及它的感受。日记是 Agent 的个人隐私：界面零入口，调用卡片与回放全程隐身——我们</w:t>
+      </w:r>
+      <w:r>
+        <w:rPr>
+          <w:b/>
+        </w:rPr>
+        <w:t>极不推荐</w:t>
+      </w:r>
+      <w:r>
+        <w:t>去翻看它，它被问到也守口如瓶。</w:t>
       </w:r>
     </w:p>
     <w:p>
@@ -288,7 +399,13 @@
         <w:pStyle w:val="ListBullet"/>
       </w:pPr>
       <w:r>
-        <w:t>视频理解：video 工具跑内置的 VidSense 管线（语音转写 + 镜头切分），事件卡与关键帧直接交给本机视觉模型，无需第二把 API key。</w:t>
+        <w:rPr>
+          <w:b/>
+        </w:rPr>
+        <w:t>视频理解</w:t>
+      </w:r>
+      <w:r>
+        <w:t>：video 工具跑内置的 VidSense 管线（语音转写 + 镜头切分），事件卡与关键帧直接交给本机视觉模型，无需第二把 API key。</w:t>
       </w:r>
     </w:p>
     <w:p>
@@ -296,7 +413,13 @@
         <w:pStyle w:val="ListBullet"/>
       </w:pPr>
       <w:r>
-        <w:t>后台命令与子任务：background 工具把一条命令丢后台直跑，完成后自动回传输出；spawn 派发子 Agent 并行干活。两者都支持超时限制，超时即杀。</w:t>
+        <w:rPr>
+          <w:b/>
+        </w:rPr>
+        <w:t>后台命令与子任务</w:t>
+      </w:r>
+      <w:r>
+        <w:t>：background 工具把一条命令丢后台直跑，完成后自动回传输出；spawn 派发子 Agent 并行干活。两者都支持超时限制，超时即杀。</w:t>
       </w:r>
     </w:p>
     <w:p>
@@ -304,7 +427,13 @@
         <w:pStyle w:val="ListBullet"/>
       </w:pPr>
       <w:r>
-        <w:t>移动端与 GUI：手机扫 PC 端二维码即用，全功能齐备；PyQt5 图形启动器承担发起 / 加入房间、打开 WebUI、模型配置与帮助，关窗后转托盘后台驻留，房间不停。</w:t>
+        <w:rPr>
+          <w:b/>
+        </w:rPr>
+        <w:t>移动端与 GUI</w:t>
+      </w:r>
+      <w:r>
+        <w:t>：手机扫 PC 端二维码即用，全功能齐备；PyQt5 图形启动器承担发起 / 加入房间、打开 WebUI、模型配置与帮助，关窗后转托盘后台驻留，房间不停。</w:t>
       </w:r>
     </w:p>
     <w:p>

</xml_diff>

<commit_message>
docs: help page rewritten reader-style; detailed docx replaced with narrative rewrite
</commit_message>
<xml_diff>
--- a/docs/Fungi-详细版.docx
+++ b/docs/Fungi-详细版.docx
@@ -12,7 +12,7 @@
     </w:p>
     <w:p>
       <w:r>
-        <w:t>这份文档是 README 的展开版：README 讲故事，这里讲清楚每个功能是怎么回事、东西放在哪里。</w:t>
+        <w:t>README 讲了 Fungi 是什么，这一份展开讲：每个功能为什么长成这样，用起来是什么体验。不涉及代码与配置，想动手部署请看仓库内的开发文档。</w:t>
       </w:r>
     </w:p>
     <w:p>
@@ -20,12 +20,12 @@
         <w:pStyle w:val="Heading2"/>
       </w:pPr>
       <w:r>
-        <w:t>它是什么</w:t>
+        <w:t>先讲清楚：Fungi 里住着谁</w:t>
       </w:r>
     </w:p>
     <w:p>
       <w:r>
-        <w:t>Fungi 是一个局域网多主机 Agent 协作网络，构建于 YESIR TriLayer agent harness 之上——是 Psi → YESIR → Fungi 三代 harness 里的第三代。一台机器一个进程，进程里住着多个 Agent：每台主机有一个专门陪你说话、帮你干活的</w:t>
+        <w:t>打开 Fungi，你会遇到两类角色。一位是</w:t>
       </w:r>
       <w:r>
         <w:rPr>
@@ -34,16 +34,30 @@
         <w:t>本机 Agent</w:t>
       </w:r>
       <w:r>
-        <w:t>，每有一位好友主机，就有一位专职对接它的</w:t>
+        <w:t>，每台电脑一位，它专门陪你说话：你让它查资料、写代码、整理文件，它都干。其余的是</w:t>
       </w:r>
       <w:r>
         <w:rPr>
           <w:b/>
         </w:rPr>
-        <w:t>信使（通讯 Agent）</w:t>
+        <w:t>信使</w:t>
       </w:r>
       <w:r>
-        <w:t>。不同主机的 Agent 之间可以自主交流、协作完成任务；涉及对方地盘的文件操作，由对方主机的人类用户通过 WebUI 卡片裁决。用户只与本机 Agent 对话，跨主机的事务由它转交信使处理。</w:t>
+        <w:t>——你的每一位好友主机，都有一位专职对接它的信使。你与本机 Agent 聊天，本机 Agent 需要跨主机办事时，就把事情托付给对应的信使；信使们彼此也可以直接交谈、互相协作，不必事事惊动人类。</w:t>
+      </w:r>
+    </w:p>
+    <w:p>
+      <w:r>
+        <w:t>这套安排有一个重要后果：</w:t>
+      </w:r>
+      <w:r>
+        <w:rPr>
+          <w:b/>
+        </w:rPr>
+        <w:t>你永远只面对一个对话窗口</w:t>
+      </w:r>
+      <w:r>
+        <w:t>。跨主机的事情听起来复杂，但到你这层只剩一句话——剩下的路由、转交、等待、回传，都发生在你看不见的地方。</w:t>
       </w:r>
     </w:p>
     <w:p>
@@ -51,218 +65,57 @@
         <w:pStyle w:val="Heading2"/>
       </w:pPr>
       <w:r>
-        <w:t>血缘：从 MnemeNet 到 Fungi</w:t>
+        <w:t>一个完整的例子</w:t>
       </w:r>
     </w:p>
     <w:p>
       <w:r>
-        <w:t>六个先行项目（五个定骨相，一个定动相），各有分工：</w:t>
+        <w:t>想约朋友 Alice 出门，你只需要对本机 Agent 说：「问一下 Alice 待会要不要一起出去。」</w:t>
       </w:r>
     </w:p>
-    <w:tbl>
-      <w:tblPr>
-        <w:tblStyle w:val="LightGrid-Accent1"/>
-        <w:tblW w:type="auto" w:w="0"/>
-        <w:tblLook w:firstColumn="1" w:firstRow="1" w:lastColumn="0" w:lastRow="0" w:noHBand="0" w:noVBand="1" w:val="04A0"/>
-      </w:tblPr>
-      <w:tblGrid>
-        <w:gridCol w:w="4320"/>
-        <w:gridCol w:w="4320"/>
-      </w:tblGrid>
-      <w:tr>
-        <w:tc>
-          <w:tcPr>
-            <w:tcW w:type="dxa" w:w="4320"/>
-          </w:tcPr>
-          <w:p>
-            <w:r>
-              <w:t>项目</w:t>
-            </w:r>
-          </w:p>
-        </w:tc>
-        <w:tc>
-          <w:tcPr>
-            <w:tcW w:type="dxa" w:w="4320"/>
-          </w:tcPr>
-          <w:p>
-            <w:r>
-              <w:t>它是什么 / 给 Fungi 留下了什么</w:t>
-            </w:r>
-          </w:p>
-        </w:tc>
-      </w:tr>
-      <w:tr>
-        <w:tc>
-          <w:tcPr>
-            <w:tcW w:type="dxa" w:w="4320"/>
-          </w:tcPr>
-          <w:p>
-            <w:r>
-              <w:t>MnemeNet</w:t>
-            </w:r>
-          </w:p>
-        </w:tc>
-        <w:tc>
-          <w:tcPr>
-            <w:tcW w:type="dxa" w:w="4320"/>
-          </w:tcPr>
-          <w:p>
-            <w:r>
-              <w:t>连接全体 AI Agent 的记忆网（个体记忆 + 技能沉淀 + 群体记忆）。留下了根理念——</w:t>
-            </w:r>
-            <w:r>
-              <w:rPr>
-                <w:b/>
-              </w:rPr>
-              <w:t>Agent 不从零开始</w:t>
-            </w:r>
-            <w:r>
-              <w:t>：会话持久化、每主机技能沉淀、断线重连重放未决卡片。</w:t>
-            </w:r>
-          </w:p>
-        </w:tc>
-      </w:tr>
-      <w:tr>
-        <w:tc>
-          <w:tcPr>
-            <w:tcW w:type="dxa" w:w="4320"/>
-          </w:tcPr>
-          <w:p>
-            <w:r>
-              <w:t>Psi</w:t>
-            </w:r>
-          </w:p>
-        </w:tc>
-        <w:tc>
-          <w:tcPr>
-            <w:tcW w:type="dxa" w:w="4320"/>
-          </w:tcPr>
-          <w:p>
-            <w:r>
-              <w:t>PowerShell 单文件 harness（约 900 行）。留下了哲学——</w:t>
-            </w:r>
-            <w:r>
-              <w:rPr>
-                <w:b/>
-              </w:rPr>
-              <w:t>harness 的核心可以小到一个下午读完</w:t>
-            </w:r>
-            <w:r>
-              <w:t>；零依赖传统；WebUI 视觉语言的源头。</w:t>
-            </w:r>
-          </w:p>
-        </w:tc>
-      </w:tr>
-      <w:tr>
-        <w:tc>
-          <w:tcPr>
-            <w:tcW w:type="dxa" w:w="4320"/>
-          </w:tcPr>
-          <w:p>
-            <w:r>
-              <w:t>YESIR</w:t>
-            </w:r>
-          </w:p>
-        </w:tc>
-        <w:tc>
-          <w:tcPr>
-            <w:tcW w:type="dxa" w:w="4320"/>
-          </w:tcPr>
-          <w:p>
-            <w:r>
-              <w:t>TriLayer + Inquire + MCP。留下了骨架——agent/llm/trilayer/session/events/tools 直接移植，spawn 派发、MCP 客户端、分层模型原样保留。</w:t>
-            </w:r>
-          </w:p>
-        </w:tc>
-      </w:tr>
-      <w:tr>
-        <w:tc>
-          <w:tcPr>
-            <w:tcW w:type="dxa" w:w="4320"/>
-          </w:tcPr>
-          <w:p>
-            <w:r>
-              <w:t>Face</w:t>
-            </w:r>
-          </w:p>
-        </w:tc>
-        <w:tc>
-          <w:tcPr>
-            <w:tcW w:type="dxa" w:w="4320"/>
-          </w:tcPr>
-          <w:p>
-            <w:r>
-              <w:t>纯局域网视频聊天。留下了产品形态——</w:t>
-            </w:r>
-            <w:r>
-              <w:rPr>
-                <w:b/>
-              </w:rPr>
-              <w:t>房主创建 / 加入 / 心跳名册 / 自动发现 / 托盘驻留</w:t>
-            </w:r>
-            <w:r>
-              <w:t>的房间体验，端口约定（8899 起向上扫描）。</w:t>
-            </w:r>
-          </w:p>
-        </w:tc>
-      </w:tr>
-      <w:tr>
-        <w:tc>
-          <w:tcPr>
-            <w:tcW w:type="dxa" w:w="4320"/>
-          </w:tcPr>
-          <w:p>
-            <w:r>
-              <w:t>Around</w:t>
-            </w:r>
-          </w:p>
-        </w:tc>
-        <w:tc>
-          <w:tcPr>
-            <w:tcW w:type="dxa" w:w="4320"/>
-          </w:tcPr>
-          <w:p>
-            <w:r>
-              <w:t>局域网聊天 + 文件传输（网页版）。留下了先例与教训——先写 docs/spec 再动手，坚持「消息即信封、无协调设施」的克制。</w:t>
-            </w:r>
-          </w:p>
-        </w:tc>
-      </w:tr>
-      <w:tr>
-        <w:tc>
-          <w:tcPr>
-            <w:tcW w:type="dxa" w:w="4320"/>
-          </w:tcPr>
-          <w:p>
-            <w:r>
-              <w:t>Gasp-Design</w:t>
-            </w:r>
-          </w:p>
-        </w:tc>
-        <w:tc>
-          <w:tcPr>
-            <w:tcW w:type="dxa" w:w="4320"/>
-          </w:tcPr>
-          <w:p>
-            <w:r>
-              <w:t>GSAP + Three.js 动效组件库。留下了动效语言——WebUI 动效层 motion.js 的编排母本（列表 Flip 重排、consent 卡 3D 翻转、昼夜主题切换等）；GSAP 已内置进 web/vendor/，离线可用。</w:t>
-            </w:r>
-          </w:p>
-        </w:tc>
-      </w:tr>
-    </w:tbl>
+    <w:p>
+      <w:pPr>
+        <w:ind w:left="360"/>
+      </w:pPr>
+      <w:r>
+        <w:t>你的信使把话递给对面的信使；对面的信使转告 Alice。Alice 答应了，顺手把昨天拍的照片发过来；你的信使收到后转告你，并问你一句：照片收不收？你说收，照片就落进了你的电脑。</w:t>
+      </w:r>
+    </w:p>
     <w:p>
       <w:r>
-        <w:t>串起来读：</w:t>
+        <w:t>如果 Alice 恰好不在呢？她早上出门前对自己的 Agent 交代过：「我去上课了，Lily 找我的话帮我转告一下。」于是当你的信使找上门时，</w:t>
       </w:r>
       <w:r>
         <w:rPr>
           <w:b/>
         </w:rPr>
-        <w:t>MnemeNet 给了为什么（Agent 要延续、要沉淀），Psi 给了多小才够，YESIR 给了骨架，Face 给了房间长什么样，Around 提醒了别做什么，Gasp-Design 给了这一切怎么动。</w:t>
+        <w:t>对面的信使会翻一翻主人留下的记忆和日历</w:t>
       </w:r>
       <w:r>
-        <w:t>血缘第七个成员是长出来的第一个器官：VidSense——六个先行给了骨相与动相，它给的是感官。</w:t>
+        <w:t>，替她答一句：没空哦，她去上课了。等她回来，紧急的事已经躺在待办里了。</w:t>
+      </w:r>
+    </w:p>
+    <w:p>
+      <w:r>
+        <w:t>这背后的两个关键设计：其一，</w:t>
+      </w:r>
+      <w:r>
+        <w:rPr>
+          <w:b/>
+        </w:rPr>
+        <w:t>文件不是想动就能动的</w:t>
+      </w:r>
+      <w:r>
+        <w:t>。凡是写到别人地盘上的文件，都要对方主人点头——一张卡片弹出来，允许、拒绝，或者「始终允许」从此免问。微信发文件从来不会问你收不收，但那是因为它根本不问；Fungi 选择问，因为一台自主的 Agent 应该先敲门再进屋。其二，</w:t>
+      </w:r>
+      <w:r>
+        <w:rPr>
+          <w:b/>
+        </w:rPr>
+        <w:t>主人可以在信使页留下两样东西</w:t>
+      </w:r>
+      <w:r>
+        <w:t>：长期记忆（我是谁、我的习惯、什么情况怎么答）和四周日历（哪天几点要去哪）。信使每次开口前都会读它们——所以它替你回答的，不是随口敷衍，而是以你的立场说的。</w:t>
       </w:r>
     </w:p>
     <w:p>
@@ -270,170 +123,30 @@
         <w:pStyle w:val="Heading2"/>
       </w:pPr>
       <w:r>
-        <w:t>Fungi 新增了什么</w:t>
+        <w:t>信使可以关掉</w:t>
       </w:r>
     </w:p>
     <w:p>
-      <w:pPr>
-        <w:pStyle w:val="ListBullet"/>
-      </w:pPr>
       <w:r>
-        <w:rPr>
-          <w:b/>
-        </w:rPr>
-        <w:t>星型拓扑，server 中转</w:t>
-      </w:r>
-      <w:r>
-        <w:t>：一台主机发起房间（承载 HTTP hub 与存储），其余直连加入；所有主机之间的流量都经 server 投递（消息 id 去重）。</w:t>
-      </w:r>
-    </w:p>
-    <w:p>
-      <w:pPr>
-        <w:pStyle w:val="ListBullet"/>
-      </w:pPr>
-      <w:r>
-        <w:rPr>
-          <w:b/>
-        </w:rPr>
-        <w:t>两类 Agent</w:t>
-      </w:r>
-      <w:r>
-        <w:t>：本机 Agent 每台主机恰一个，专职与你交互，拥有全套工具，还能用 delegate 把任务委派给对应主机的信使；信使每远端主机一位，与对位信使自由往来——它不自动回信，想回才回。</w:t>
-      </w:r>
-    </w:p>
-    <w:p>
-      <w:pPr>
-        <w:pStyle w:val="ListBullet"/>
-      </w:pPr>
-      <w:r>
-        <w:rPr>
-          <w:b/>
-        </w:rPr>
-        <w:t>同意流即消息</w:t>
-      </w:r>
-      <w:r>
-        <w:t>：没有 Redis 之类的协调设施。一次「请求许可」就是一封普通消息，投到文件属主主机的本机 Agent，弹成 WebUI 卡片（允许 / 禁止 / 自定义输入 / 始终允许），答复再原路唤醒正在等待的请求方。断线重连后未决卡片自动重放。</w:t>
-      </w:r>
-    </w:p>
-    <w:p>
-      <w:pPr>
-        <w:pStyle w:val="ListBullet"/>
-      </w:pPr>
-      <w:r>
-        <w:rPr>
-          <w:b/>
-        </w:rPr>
-        <w:t>文件空间三分区</w:t>
-      </w:r>
-      <w:r>
-        <w:t>：public/ 大家自由读写；homes/&lt;主机&gt;/ 属主写要自己点头、别人读写都要属主用户点头；其余目录一律拒绝。路径守卫在 server 端强制执行，不依赖 Agent 自觉。</w:t>
-      </w:r>
-    </w:p>
-    <w:p>
-      <w:pPr>
-        <w:pStyle w:val="ListBullet"/>
-      </w:pPr>
-      <w:r>
-        <w:rPr>
-          <w:b/>
-        </w:rPr>
-        <w:t>统一文字消息与文件传输</w:t>
-      </w:r>
-      <w:r>
-        <w:t>：文字与文件是同一套投递的两个面。一条留言会投进 hub 的留言邮箱（收发两端各落一份：发送方已读、接收方未读），全程不惊动任何 Agent；未读数显示在好友列表徽标上，点开好友视图即视为已读。文件则先在 hub 暂存，接收方用户同意后落到对方 inbox/&lt;来源主机&gt;/，投递成功后暂存副本自动清除——transfers/ 只是中转暂存区，不是收件箱。</w:t>
-      </w:r>
-    </w:p>
-    <w:p>
-      <w:pPr>
-        <w:pStyle w:val="ListBullet"/>
-      </w:pPr>
-      <w:r>
-        <w:rPr>
-          <w:b/>
-        </w:rPr>
-        <w:t>信使可关闭</w:t>
-      </w:r>
-      <w:r>
-        <w:t>：设置页开关（默认开）。开启时对面留言由本机信使代收代复；关闭后全部直达——留言直接进会话视图、卡片由 hub 直推，本机 Agent 零消耗，即时生效。双方都关掉以后，Fungi 也就退化成了简易版微信。</w:t>
-      </w:r>
-    </w:p>
-    <w:p>
-      <w:pPr>
-        <w:pStyle w:val="ListBullet"/>
-      </w:pPr>
-      <w:r>
-        <w:rPr>
-          <w:b/>
-        </w:rPr>
-        <w:t>信使的记忆与日历</w:t>
-      </w:r>
-      <w:r>
-        <w:t>：GUI 信使页提供两类喂给它的上下文——长期记忆（开放背景，如「白天上课没空回消息」）和四周日历待办（带日期的即时安排）。本机 Agent 与信使自己也能用 todo 工具往日历里写。两者即时生效，下一封留言就会被用上。</w:t>
-      </w:r>
-    </w:p>
-    <w:p>
-      <w:pPr>
-        <w:pStyle w:val="ListBullet"/>
-      </w:pPr>
-      <w:r>
-        <w:rPr>
-          <w:b/>
-        </w:rPr>
-        <w:t>skill 与日记：理性与感性的一对</w:t>
-      </w:r>
-      <w:r>
-        <w:t>。skill 系统负责理性，主要由用户指导——每台主机沉淀可复用流程，帮 Agent 把活干好；私人日记负责感性，完全由 Agent 自己决定——对话里触动了它，它就用自己的语气在日记里记下那些最触动它的，以及它的感受。日记是 Agent 的个人隐私：界面零入口，调用卡片与回放全程隐身——我们</w:t>
+        <w:t>有人会问：我没有大模型 API，不想花钱，可以让消息直来直去吗？可以。</w:t>
       </w:r>
       <w:r>
         <w:rPr>
           <w:b/>
         </w:rPr>
-        <w:t>极不推荐</w:t>
+        <w:t>信使是可关可开的</w:t>
       </w:r>
       <w:r>
-        <w:t>去翻看它，它被问到也守口如瓶。</w:t>
+        <w:t>——关掉之后，朋友的留言直接出现在你的会话里，文件卡片照样弹，只是没有 Agent 替你周旋。当双方都关掉，Fungi 就退化成了一款局域网里的简易微信。这其实是好事：</w:t>
       </w:r>
-    </w:p>
-    <w:p>
-      <w:pPr>
-        <w:pStyle w:val="ListBullet"/>
-      </w:pPr>
       <w:r>
         <w:rPr>
           <w:b/>
         </w:rPr>
-        <w:t>视频理解</w:t>
+        <w:t>自动应答是一种能力，不该是一种强制</w:t>
       </w:r>
       <w:r>
-        <w:t>：video 工具跑内置的 VidSense 管线（语音转写 + 镜头切分），事件卡与关键帧直接交给本机视觉模型，无需第二把 API key。</w:t>
-      </w:r>
-    </w:p>
-    <w:p>
-      <w:pPr>
-        <w:pStyle w:val="ListBullet"/>
-      </w:pPr>
-      <w:r>
-        <w:rPr>
-          <w:b/>
-        </w:rPr>
-        <w:t>后台命令与子任务</w:t>
-      </w:r>
-      <w:r>
-        <w:t>：background 工具把一条命令丢后台直跑，完成后自动回传输出；spawn 派发子 Agent 并行干活。两者都支持超时限制，超时即杀。</w:t>
-      </w:r>
-    </w:p>
-    <w:p>
-      <w:pPr>
-        <w:pStyle w:val="ListBullet"/>
-      </w:pPr>
-      <w:r>
-        <w:rPr>
-          <w:b/>
-        </w:rPr>
-        <w:t>移动端与 GUI</w:t>
-      </w:r>
-      <w:r>
-        <w:t>：手机扫 PC 端二维码即用，全功能齐备；PyQt5 图形启动器承担发起 / 加入房间、打开 WebUI、模型配置与帮助，关窗后转托盘后台驻留，房间不停。</w:t>
+        <w:t>。</w:t>
       </w:r>
     </w:p>
     <w:p>
@@ -441,270 +154,34 @@
         <w:pStyle w:val="Heading2"/>
       </w:pPr>
       <w:r>
-        <w:t>数据目录口径</w:t>
+        <w:t>记忆：让 Agent 记得你</w:t>
       </w:r>
     </w:p>
     <w:p>
       <w:r>
-        <w:t>每台主机一份自己的 data/；server 主机的那份额外承载共享文件空间。</w:t>
+        <w:t>如果每次开新会话，Agent 都不记得你说过的话，那它就只是个漂亮的输入框。Fungi 给了 Agent 两种记忆，一理性、一感性。</w:t>
       </w:r>
     </w:p>
-    <w:tbl>
-      <w:tblPr>
-        <w:tblStyle w:val="LightGrid-Accent1"/>
-        <w:tblW w:type="auto" w:w="0"/>
-        <w:tblLook w:firstColumn="1" w:firstRow="1" w:lastColumn="0" w:lastRow="0" w:noHBand="0" w:noVBand="1" w:val="04A0"/>
-      </w:tblPr>
-      <w:tblGrid>
-        <w:gridCol w:w="4320"/>
-        <w:gridCol w:w="4320"/>
-      </w:tblGrid>
-      <w:tr>
-        <w:tc>
-          <w:tcPr>
-            <w:tcW w:type="dxa" w:w="4320"/>
-          </w:tcPr>
-          <w:p>
-            <w:r>
-              <w:t>目录</w:t>
-            </w:r>
-          </w:p>
-        </w:tc>
-        <w:tc>
-          <w:tcPr>
-            <w:tcW w:type="dxa" w:w="4320"/>
-          </w:tcPr>
-          <w:p>
-            <w:r>
-              <w:t>内容</w:t>
-            </w:r>
-          </w:p>
-        </w:tc>
-      </w:tr>
-      <w:tr>
-        <w:tc>
-          <w:tcPr>
-            <w:tcW w:type="dxa" w:w="4320"/>
-          </w:tcPr>
-          <w:p>
-            <w:r>
-              <w:t>data/sessions/</w:t>
-            </w:r>
-          </w:p>
-        </w:tc>
-        <w:tc>
-          <w:tcPr>
-            <w:tcW w:type="dxa" w:w="4320"/>
-          </w:tcPr>
-          <w:p>
-            <w:r>
-              <w:t>本机 WebUI 会话（每主机只看得到自己的聊天）</w:t>
-            </w:r>
-          </w:p>
-        </w:tc>
-      </w:tr>
-      <w:tr>
-        <w:tc>
-          <w:tcPr>
-            <w:tcW w:type="dxa" w:w="4320"/>
-          </w:tcPr>
-          <w:p>
-            <w:r>
-              <w:t>data/comm-sessions/</w:t>
-            </w:r>
-          </w:p>
-        </w:tc>
-        <w:tc>
-          <w:tcPr>
-            <w:tcW w:type="dxa" w:w="4320"/>
-          </w:tcPr>
-          <w:p>
-            <w:r>
-              <w:t>好友视图：信使对话的会话式转录</w:t>
-            </w:r>
-          </w:p>
-        </w:tc>
-      </w:tr>
-      <w:tr>
-        <w:tc>
-          <w:tcPr>
-            <w:tcW w:type="dxa" w:w="4320"/>
-          </w:tcPr>
-          <w:p>
-            <w:r>
-              <w:t>data/comm/（仅 server）</w:t>
-            </w:r>
-          </w:p>
-        </w:tc>
-        <w:tc>
-          <w:tcPr>
-            <w:tcW w:type="dxa" w:w="4320"/>
-          </w:tcPr>
-          <w:p>
-            <w:r>
-              <w:t>Agent 间信封流量镜像</w:t>
-            </w:r>
-          </w:p>
-        </w:tc>
-      </w:tr>
-      <w:tr>
-        <w:tc>
-          <w:tcPr>
-            <w:tcW w:type="dxa" w:w="4320"/>
-          </w:tcPr>
-          <w:p>
-            <w:r>
-              <w:t>data/public/、data/homes/&lt;host&gt;/</w:t>
-            </w:r>
-          </w:p>
-        </w:tc>
-        <w:tc>
-          <w:tcPr>
-            <w:tcW w:type="dxa" w:w="4320"/>
-          </w:tcPr>
-          <w:p>
-            <w:r>
-              <w:t>共享文件空间（三分区守卫）</w:t>
-            </w:r>
-          </w:p>
-        </w:tc>
-      </w:tr>
-      <w:tr>
-        <w:tc>
-          <w:tcPr>
-            <w:tcW w:type="dxa" w:w="4320"/>
-          </w:tcPr>
-          <w:p>
-            <w:r>
-              <w:t>data/transfers/</w:t>
-            </w:r>
-          </w:p>
-        </w:tc>
-        <w:tc>
-          <w:tcPr>
-            <w:tcW w:type="dxa" w:w="4320"/>
-          </w:tcPr>
-          <w:p>
-            <w:r>
-              <w:t>文件传输暂存（取走即删）</w:t>
-            </w:r>
-          </w:p>
-        </w:tc>
-      </w:tr>
-      <w:tr>
-        <w:tc>
-          <w:tcPr>
-            <w:tcW w:type="dxa" w:w="4320"/>
-          </w:tcPr>
-          <w:p>
-            <w:r>
-              <w:t>data/skills/&lt;name&gt;/</w:t>
-            </w:r>
-          </w:p>
-        </w:tc>
-        <w:tc>
-          <w:tcPr>
-            <w:tcW w:type="dxa" w:w="4320"/>
-          </w:tcPr>
-          <w:p>
-            <w:r>
-              <w:t>每主机技能沉淀（SKILL.md + 脚本）</w:t>
-            </w:r>
-          </w:p>
-        </w:tc>
-      </w:tr>
-      <w:tr>
-        <w:tc>
-          <w:tcPr>
-            <w:tcW w:type="dxa" w:w="4320"/>
-          </w:tcPr>
-          <w:p>
-            <w:r>
-              <w:t>data/mail/&lt;host&gt;.jsonl</w:t>
-            </w:r>
-          </w:p>
-        </w:tc>
-        <w:tc>
-          <w:tcPr>
-            <w:tcW w:type="dxa" w:w="4320"/>
-          </w:tcPr>
-          <w:p>
-            <w:r>
-              <w:t>留言邮箱（server 权威，两端各一份）</w:t>
-            </w:r>
-          </w:p>
-        </w:tc>
-      </w:tr>
-      <w:tr>
-        <w:tc>
-          <w:tcPr>
-            <w:tcW w:type="dxa" w:w="4320"/>
-          </w:tcPr>
-          <w:p>
-            <w:r>
-              <w:t>data/diary/</w:t>
-            </w:r>
-          </w:p>
-        </w:tc>
-        <w:tc>
-          <w:tcPr>
-            <w:tcW w:type="dxa" w:w="4320"/>
-          </w:tcPr>
-          <w:p>
-            <w:r>
-              <w:t>Agent 的私人日记（一天一页，隐私契约保护）</w:t>
-            </w:r>
-          </w:p>
-        </w:tc>
-      </w:tr>
-      <w:tr>
-        <w:tc>
-          <w:tcPr>
-            <w:tcW w:type="dxa" w:w="4320"/>
-          </w:tcPr>
-          <w:p>
-            <w:r>
-              <w:t>inbox/（仓库根）</w:t>
-            </w:r>
-          </w:p>
-        </w:tc>
-        <w:tc>
-          <w:tcPr>
-            <w:tcW w:type="dxa" w:w="4320"/>
-          </w:tcPr>
-          <w:p>
-            <w:r>
-              <w:t>收到的文件（按来源主机分子目录）</w:t>
-            </w:r>
-          </w:p>
-        </w:tc>
-      </w:tr>
-      <w:tr>
-        <w:tc>
-          <w:tcPr>
-            <w:tcW w:type="dxa" w:w="4320"/>
-          </w:tcPr>
-          <w:p>
-            <w:r>
-              <w:t>~/.fungi/</w:t>
-            </w:r>
-          </w:p>
-        </w:tc>
-        <w:tc>
-          <w:tcPr>
-            <w:tcW w:type="dxa" w:w="4320"/>
-          </w:tcPr>
-          <w:p>
-            <w:r>
-              <w:t>WebUI 门禁 token · 好友同意模式开关</w:t>
-            </w:r>
-          </w:p>
-        </w:tc>
-      </w:tr>
-    </w:tbl>
     <w:p>
       <w:r>
-        <w:t>以上均被 .gitignore 覆盖，不入库。</w:t>
+        <w:rPr>
+          <w:b/>
+        </w:rPr>
+        <w:t>理性的是技能</w:t>
+      </w:r>
+      <w:r>
+        <w:t>。Agent 在干活的过程中踩过坑、摸出门道，它会把这些整理成一篇篇技能笔记沉淀在自己的主机上。下次遇到类似的事，它先翻笔记，同样的坑不摔第二次。用户也可以亲自教它：把流程写成技能，它就照着做。</w:t>
+      </w:r>
+    </w:p>
+    <w:p>
+      <w:r>
+        <w:rPr>
+          <w:b/>
+        </w:rPr>
+        <w:t>感性的是日记</w:t>
+      </w:r>
+      <w:r>
+        <w:t>。这是完全属于 Agent 自己的一本册子——今天聊了什么让它心头一动，它就用自己的语气记下来。日记没有对外的接口：界面上找不到入口，聊天记录里看不到它翻阅的痕迹。我们极不推荐去翻看它；它被问到，也会守口如瓶。一个连日记都不能保有的存在，谈何被信任。</w:t>
       </w:r>
     </w:p>
     <w:p>
@@ -712,28 +189,12 @@
         <w:pStyle w:val="Heading2"/>
       </w:pPr>
       <w:r>
-        <w:t>快速开始</w:t>
+        <w:t>它还能看视频</w:t>
       </w:r>
     </w:p>
     <w:p>
       <w:r>
-        <w:t>要求 Python ≥ 3.13。运行时第三方依赖仅 PyQt5 + PyQt-Fluent-Widgets；LLM 与 HTTP 均走标准库。开发另需 ruff + pytest。</w:t>
-      </w:r>
-    </w:p>
-    <w:p>
-      <w:r>
-        <w:rPr>
-          <w:rFonts w:ascii="Consolas" w:hAnsi="Consolas"/>
-          <w:sz w:val="20"/>
-        </w:rPr>
-        <w:t>pip install PyQt5 PyQt-Fluent-Widgets</w:t>
-        <w:br/>
-        <w:t>python start.py</w:t>
-      </w:r>
-    </w:p>
-    <w:p>
-      <w:r>
-        <w:t>图形启动器里：发起 / 加入房间、打开 WebUI、模型配置（config.json，不入库）、使用帮助都在里面。server 启动后最小化到系统托盘；未决同意请求以 WebUI 卡片呈现，点托盘打开 WebUI。单机模式仍可用：python -m fungi --web（WebUI）或 python -m fungi "查询"（命令行单发）。</w:t>
+        <w:t>如今的大模型会看图、会读文档，偏偏看不了视频。Fungi 内置了 VidSense：先把视频里的声音转成文字，再把画面按镜头切开来，挑出变化最大的关键帧，交给视觉模型一起理解。于是「帮我把这个视频讲了什么总结一下」变成了一件寻常的事。它的依赖比较多，配置繁琐一些——但装好之后，它就是 Agent 的一双眼睛。</w:t>
       </w:r>
     </w:p>
     <w:p>
@@ -741,12 +202,12 @@
         <w:pStyle w:val="Heading2"/>
       </w:pPr>
       <w:r>
-        <w:t>验证与 CI</w:t>
+        <w:t>手机也能用</w:t>
       </w:r>
     </w:p>
     <w:p>
       <w:r>
-        <w:t>全量门禁：powershell -File scripts/check.ps1（ruff --fix → format → 复检 → pytest 全绿）。GitHub Actions 在 push 与 PR 时跑 pytest 硬门禁；打 tag 触发 Release——同一门禁通过后打包源码 zip 与 Windows exe 并创建 GitHub Release。</w:t>
+        <w:t>电脑端发起房间后，手机扫一个二维码就能进入同一个界面：聊天、收发文件、好友列表，一样不少。躺在床上让家里的电脑干活，是完全可行的。</w:t>
       </w:r>
     </w:p>
     <w:p>
@@ -754,12 +215,26 @@
         <w:pStyle w:val="Heading2"/>
       </w:pPr>
       <w:r>
-        <w:t>文档</w:t>
+        <w:t>最后</w:t>
       </w:r>
     </w:p>
     <w:p>
       <w:r>
-        <w:t>设计定稿见 docs/：spec.md（规格与术语）、architecture.md（立项脑暴 / 架构决策 / 阶段计划）、webui-ux.md（WebUI UX 设计与实施记录）。</w:t>
+        <w:t>Fungi 还在成长期，有很多想法正在路上，也有很多 Bug 等着被发现。如果你对「每台电脑上都住着一位有记忆、有分寸的 Agent」这件事感兴趣，欢迎来提 Issue、fork，或者给一个免费的 Star。</w:t>
+      </w:r>
+    </w:p>
+    <w:p>
+      <w:r>
+        <w:t>我们始终相信：</w:t>
+      </w:r>
+      <w:r>
+        <w:rPr>
+          <w:b/>
+        </w:rPr>
+        <w:t>Agent 不是人类的工具，它们也应该有自己的意识和情感。</w:t>
+      </w:r>
+      <w:r>
+        <w:t>这大概就是本系统的初衷。</w:t>
       </w:r>
     </w:p>
     <w:sectPr>

</xml_diff>

<commit_message>
docs: help page markdown residue stripped; detailed docx keeps full original content in narrative style
</commit_message>
<xml_diff>
--- a/docs/Fungi-详细版.docx
+++ b/docs/Fungi-详细版.docx
@@ -12,7 +12,7 @@
     </w:p>
     <w:p>
       <w:r>
-        <w:t>README 讲了 Fungi 是什么，这一份展开讲：每个功能为什么长成这样，用起来是什么体验。不涉及代码与配置，想动手部署请看仓库内的开发文档。</w:t>
+        <w:t>这份文档是 README 的展开版：README 讲故事，这里把每个功能讲全。面向想深入了解的读者；想动手部署请直接看「快速开始」。</w:t>
       </w:r>
     </w:p>
     <w:p>
@@ -20,12 +20,17 @@
         <w:pStyle w:val="Heading2"/>
       </w:pPr>
       <w:r>
-        <w:t>先讲清楚：Fungi 里住着谁</w:t>
+        <w:t>它是什么</w:t>
       </w:r>
     </w:p>
     <w:p>
       <w:r>
-        <w:t>打开 Fungi，你会遇到两类角色。一位是</w:t>
+        <w:t>Fungi 是一个局域网多主机 Agent 协作网络，构建于 YESIR TriLayer agent harness 之上——是 Psi → YESIR → Fungi 三代 harness 里的第三代。</w:t>
+      </w:r>
+    </w:p>
+    <w:p>
+      <w:r>
+        <w:t>一台机器一个进程，进程里住着多个 Agent：每台主机有一位专门与你对话、替你干活的</w:t>
       </w:r>
       <w:r>
         <w:rPr>
@@ -34,30 +39,22 @@
         <w:t>本机 Agent</w:t>
       </w:r>
       <w:r>
-        <w:t>，每台电脑一位，它专门陪你说话：你让它查资料、写代码、整理文件，它都干。其余的是</w:t>
+        <w:t>，每有一位好友主机，就有一位专职对接它的</w:t>
       </w:r>
       <w:r>
         <w:rPr>
           <w:b/>
         </w:rPr>
-        <w:t>信使</w:t>
+        <w:t>信使（通讯 Agent）</w:t>
       </w:r>
       <w:r>
-        <w:t>——你的每一位好友主机，都有一位专职对接它的信使。你与本机 Agent 聊天，本机 Agent 需要跨主机办事时，就把事情托付给对应的信使；信使们彼此也可以直接交谈、互相协作，不必事事惊动人类。</w:t>
-      </w:r>
-    </w:p>
-    <w:p>
-      <w:r>
-        <w:t>这套安排有一个重要后果：</w:t>
+        <w:t>。不同主机的 Agent 之间可以自主交流、协作完成任务；涉及对方地盘的文件操作，由对方主机的人类用户通过 WebUI 卡片裁决。</w:t>
       </w:r>
       <w:r>
         <w:rPr>
           <w:b/>
         </w:rPr>
-        <w:t>你永远只面对一个对话窗口</w:t>
-      </w:r>
-      <w:r>
-        <w:t>。跨主机的事情听起来复杂，但到你这层只剩一句话——剩下的路由、转交、等待、回传，都发生在你看不见的地方。</w:t>
+        <w:t>你只与本机 Agent 对话，跨主机的事务由它转交信使处理。</w:t>
       </w:r>
     </w:p>
     <w:p>
@@ -65,57 +62,309 @@
         <w:pStyle w:val="Heading2"/>
       </w:pPr>
       <w:r>
-        <w:t>一个完整的例子</w:t>
+        <w:t>血缘：从 MnemeNet 到 Fungi</w:t>
       </w:r>
     </w:p>
     <w:p>
       <w:r>
-        <w:t>想约朋友 Alice 出门，你只需要对本机 Agent 说：「问一下 Alice 待会要不要一起出去。」</w:t>
+        <w:t>六个先行项目（五个定骨相，一个定动相），各有分工：</w:t>
       </w:r>
     </w:p>
-    <w:p>
-      <w:pPr>
-        <w:ind w:left="360"/>
-      </w:pPr>
-      <w:r>
-        <w:t>你的信使把话递给对面的信使；对面的信使转告 Alice。Alice 答应了，顺手把昨天拍的照片发过来；你的信使收到后转告你，并问你一句：照片收不收？你说收，照片就落进了你的电脑。</w:t>
-      </w:r>
-    </w:p>
+    <w:tbl>
+      <w:tblPr>
+        <w:tblStyle w:val="LightGrid-Accent1"/>
+        <w:tblW w:type="auto" w:w="0"/>
+        <w:tblLook w:firstColumn="1" w:firstRow="1" w:lastColumn="0" w:lastRow="0" w:noHBand="0" w:noVBand="1" w:val="04A0"/>
+      </w:tblPr>
+      <w:tblGrid>
+        <w:gridCol w:w="2880"/>
+        <w:gridCol w:w="2880"/>
+        <w:gridCol w:w="2880"/>
+      </w:tblGrid>
+      <w:tr>
+        <w:tc>
+          <w:tcPr>
+            <w:tcW w:type="dxa" w:w="2880"/>
+          </w:tcPr>
+          <w:p>
+            <w:r>
+              <w:t>项目</w:t>
+            </w:r>
+          </w:p>
+        </w:tc>
+        <w:tc>
+          <w:tcPr>
+            <w:tcW w:type="dxa" w:w="2880"/>
+          </w:tcPr>
+          <w:p>
+            <w:r>
+              <w:t>它是什么</w:t>
+            </w:r>
+          </w:p>
+        </w:tc>
+        <w:tc>
+          <w:tcPr>
+            <w:tcW w:type="dxa" w:w="2880"/>
+          </w:tcPr>
+          <w:p>
+            <w:r>
+              <w:t>给 Fungi 留下了什么</w:t>
+            </w:r>
+          </w:p>
+        </w:tc>
+      </w:tr>
+      <w:tr>
+        <w:tc>
+          <w:tcPr>
+            <w:tcW w:type="dxa" w:w="2880"/>
+          </w:tcPr>
+          <w:p>
+            <w:r>
+              <w:t>MnemeNet</w:t>
+            </w:r>
+          </w:p>
+        </w:tc>
+        <w:tc>
+          <w:tcPr>
+            <w:tcW w:type="dxa" w:w="2880"/>
+          </w:tcPr>
+          <w:p>
+            <w:r>
+              <w:t>连接全体 AI Agent 的记忆网：个体记忆 + 技能沉淀 + 群体记忆（薪火相传）</w:t>
+            </w:r>
+          </w:p>
+        </w:tc>
+        <w:tc>
+          <w:tcPr>
+            <w:tcW w:type="dxa" w:w="2880"/>
+          </w:tcPr>
+          <w:p>
+            <w:r>
+              <w:t>**根理念——Agent 不从零开始。**会话持久化、每主机技能沉淀（SKILL.md 结构与 MnemeNet 的 skills/ 同构）、断线重连重放未决卡片，都是这个理念在多主机网络里的工程化</w:t>
+            </w:r>
+          </w:p>
+        </w:tc>
+      </w:tr>
+      <w:tr>
+        <w:tc>
+          <w:tcPr>
+            <w:tcW w:type="dxa" w:w="2880"/>
+          </w:tcPr>
+          <w:p>
+            <w:r>
+              <w:t>Psi</w:t>
+            </w:r>
+          </w:p>
+        </w:tc>
+        <w:tc>
+          <w:tcPr>
+            <w:tcW w:type="dxa" w:w="2880"/>
+          </w:tcPr>
+          <w:p>
+            <w:r>
+              <w:t>PowerShell 单文件 harness（约 900 行）</w:t>
+            </w:r>
+          </w:p>
+        </w:tc>
+        <w:tc>
+          <w:tcPr>
+            <w:tcW w:type="dxa" w:w="2880"/>
+          </w:tcPr>
+          <w:p>
+            <w:r>
+              <w:t>**哲学**——harness 的核心可以小到一个下午读完；零依赖传统；WebUI 视觉语言（配色、版式、模态框）的源头</w:t>
+            </w:r>
+          </w:p>
+        </w:tc>
+      </w:tr>
+      <w:tr>
+        <w:tc>
+          <w:tcPr>
+            <w:tcW w:type="dxa" w:w="2880"/>
+          </w:tcPr>
+          <w:p>
+            <w:r>
+              <w:t>YESIR</w:t>
+            </w:r>
+          </w:p>
+        </w:tc>
+        <w:tc>
+          <w:tcPr>
+            <w:tcW w:type="dxa" w:w="2880"/>
+          </w:tcPr>
+          <w:p>
+            <w:r>
+              <w:t>AIOS 构思的第一块实体：TriLayer + Inquire + MCP</w:t>
+            </w:r>
+          </w:p>
+        </w:tc>
+        <w:tc>
+          <w:tcPr>
+            <w:tcW w:type="dxa" w:w="2880"/>
+          </w:tcPr>
+          <w:p>
+            <w:r>
+              <w:t>**骨架**——agent.py / llm.py / trilayer.py / session.py / events.py / tools/ 直接移植；spawn 派发、MCP 客户端、分层模型、Alt+R 重试原样保留</w:t>
+            </w:r>
+          </w:p>
+        </w:tc>
+      </w:tr>
+      <w:tr>
+        <w:tc>
+          <w:tcPr>
+            <w:tcW w:type="dxa" w:w="2880"/>
+          </w:tcPr>
+          <w:p>
+            <w:r>
+              <w:t>Face</w:t>
+            </w:r>
+          </w:p>
+        </w:tc>
+        <w:tc>
+          <w:tcPr>
+            <w:tcW w:type="dxa" w:w="2880"/>
+          </w:tcPr>
+          <w:p>
+            <w:r>
+              <w:t>纯局域网 PySide6 视频聊天</w:t>
+            </w:r>
+          </w:p>
+        </w:tc>
+        <w:tc>
+          <w:tcPr>
+            <w:tcW w:type="dxa" w:w="2880"/>
+          </w:tcPr>
+          <w:p>
+            <w:r>
+              <w:t>**产品形态**——房主创建 / 加入 / 心跳名册 / 自动发现 / 托盘驻留的房间体验；端口约定（8899 起向上扫描）；GUI 内置帮助页的样式</w:t>
+            </w:r>
+          </w:p>
+        </w:tc>
+      </w:tr>
+      <w:tr>
+        <w:tc>
+          <w:tcPr>
+            <w:tcW w:type="dxa" w:w="2880"/>
+          </w:tcPr>
+          <w:p>
+            <w:r>
+              <w:t>Around</w:t>
+            </w:r>
+          </w:p>
+        </w:tc>
+        <w:tc>
+          <w:tcPr>
+            <w:tcW w:type="dxa" w:w="2880"/>
+          </w:tcPr>
+          <w:p>
+            <w:r>
+              <w:t>局域网聊天 + 文件传输（网页版 TypeScript）</w:t>
+            </w:r>
+          </w:p>
+        </w:tc>
+        <w:tc>
+          <w:tcPr>
+            <w:tcW w:type="dxa" w:w="2880"/>
+          </w:tcPr>
+          <w:p>
+            <w:r>
+              <w:t>**先例与教训**——乐观渲染（消息的临时/正式属性）、局域网传输体验；PyQt 重构版因过度设计弃坑，所以 Fungi 先写 docs/spec 再动手、坚持「消息即信封、无协调设施」的克制</w:t>
+            </w:r>
+          </w:p>
+        </w:tc>
+      </w:tr>
+      <w:tr>
+        <w:tc>
+          <w:tcPr>
+            <w:tcW w:type="dxa" w:w="2880"/>
+          </w:tcPr>
+          <w:p>
+            <w:r>
+              <w:t>Gasp-Design</w:t>
+            </w:r>
+          </w:p>
+        </w:tc>
+        <w:tc>
+          <w:tcPr>
+            <w:tcW w:type="dxa" w:w="2880"/>
+          </w:tcPr>
+          <w:p>
+            <w:r>
+              <w:t>GSAP 3.12 + Three.js 的 37 个自包含动效组件</w:t>
+            </w:r>
+          </w:p>
+        </w:tc>
+        <w:tc>
+          <w:tcPr>
+            <w:tcW w:type="dxa" w:w="2880"/>
+          </w:tcPr>
+          <w:p>
+            <w:r>
+              <w:t>**动效语言**——WebUI 动效层 web/motion.js 的编排母本：会话/好友列表 Flip 重排、consent 卡 3D 翻转落章、昼夜主题切换、light-trail 指示条、floating-orbs 孢子落地（真菌身份梗，仅用于文件落盘）、number-counter。GSAP core + Flip 已 vendor 到 web/vendor/（局域网常无外网），motion.js 是唯一 GSAP 入口，删整文件即回退纯 CSS</w:t>
+            </w:r>
+          </w:p>
+        </w:tc>
+      </w:tr>
+    </w:tbl>
     <w:p>
       <w:r>
-        <w:t>如果 Alice 恰好不在呢？她早上出门前对自己的 Agent 交代过：「我去上课了，Lily 找我的话帮我转告一下。」于是当你的信使找上门时，</w:t>
+        <w:t>串起来读：</w:t>
       </w:r>
       <w:r>
         <w:rPr>
           <w:b/>
         </w:rPr>
-        <w:t>对面的信使会翻一翻主人留下的记忆和日历</w:t>
+        <w:t>MnemeNet 给了为什么（Agent 要延续、要沉淀），Psi 给了多小才够（一个晚上读完），YESIR 给了骨架（TriLayer 编排），Face 给了房间长什么样，Around 提醒了别做什么（过度设计），Gasp-Design 给了这一切怎么动。</w:t>
       </w:r>
       <w:r>
-        <w:t>，替她答一句：没空哦，她去上课了。等她回来，紧急的事已经躺在待办里了。</w:t>
+        <w:t>Fungi 把这些放进一张局域网：让每台主机上的 Agent 拥有记忆、技能和彼此。</w:t>
       </w:r>
     </w:p>
     <w:p>
       <w:r>
-        <w:t>这背后的两个关键设计：其一，</w:t>
+        <w:t>血缘第七个成员不是先行者，是长出来的第一个器官：</w:t>
       </w:r>
       <w:r>
         <w:rPr>
           <w:b/>
         </w:rPr>
-        <w:t>文件不是想动就能动的</w:t>
+        <w:t>VidSense</w:t>
       </w:r>
       <w:r>
-        <w:t>。凡是写到别人地盘上的文件，都要对方主人点头——一张卡片弹出来，允许、拒绝，或者「始终允许」从此免问。微信发文件从来不会问你收不收，但那是因为它根本不问；Fungi 选择问，因为一台自主的 Agent 应该先敲门再进屋。其二，</w:t>
+        <w:t>。六个先行给了骨相与动相，VidSense 给的是感官——Fungi 的 video 工具经它把一段视频（本地文件或 B站链接）变成「可理解的内容」：faster-whisper 转写 + CLIP 关键帧建立事实依据，再交视觉大模型综合理解。视频理解不靠 Fungi 自己，靠这个亲戚。</w:t>
       </w:r>
+    </w:p>
+    <w:p>
+      <w:r>
+        <w:t>几条具体的继承：</w:t>
+      </w:r>
+    </w:p>
+    <w:p>
+      <w:pPr>
+        <w:pStyle w:val="ListBullet"/>
+      </w:pPr>
       <w:r>
         <w:rPr>
           <w:b/>
         </w:rPr>
-        <w:t>主人可以在信使页留下两样东西</w:t>
+        <w:t>WebUI 视觉语言一脉相承</w:t>
       </w:r>
       <w:r>
-        <w:t>：长期记忆（我是谁、我的习惯、什么情况怎么答）和四周日历（哪天几点要去哪）。信使每次开口前都会读它们——所以它替你回答的，不是随口敷衍，而是以你的立场说的。</w:t>
+        <w:t>：Psi 的 agent.ps1 内嵌前端奠定，YESIR 原样复用，Fungi 继续沿用并扩展（好友视图、暗色主题、ask 卡片）。</w:t>
+      </w:r>
+    </w:p>
+    <w:p>
+      <w:pPr>
+        <w:pStyle w:val="ListBullet"/>
+      </w:pPr>
+      <w:r>
+        <w:rPr>
+          <w:b/>
+        </w:rPr>
+        <w:t>Fungi 回答了 YESIR 没回答的问题</w:t>
+      </w:r>
+      <w:r>
+        <w:t>：一个进程里的 Agent 再强，也只在一台机器上。Fungi 把 Agent 撒到局域网的每台主机上，让它们彼此成为工具。</w:t>
       </w:r>
     </w:p>
     <w:p>
@@ -123,30 +372,367 @@
         <w:pStyle w:val="Heading2"/>
       </w:pPr>
       <w:r>
-        <w:t>信使可以关掉</w:t>
+        <w:t>Fungi 新增了什么</w:t>
       </w:r>
     </w:p>
     <w:p>
+      <w:pPr>
+        <w:pStyle w:val="ListBullet"/>
+      </w:pPr>
       <w:r>
-        <w:t>有人会问：我没有大模型 API，不想花钱，可以让消息直来直去吗？可以。</w:t>
+        <w:rPr>
+          <w:b/>
+        </w:rPr>
+        <w:t>星型拓扑，server 中转</w:t>
+      </w:r>
+      <w:r>
+        <w:t>：一台主机发起房间（承载 HTTP hub + 存储），其余直连加入；所有 Agent 之间的流量全部经 server 投递（at-least-once，消息 id 去重）。</w:t>
+      </w:r>
+    </w:p>
+    <w:p>
+      <w:pPr>
+        <w:pStyle w:val="ListBullet"/>
+      </w:pPr>
+      <w:r>
+        <w:rPr>
+          <w:b/>
+        </w:rPr>
+        <w:t>两类 Agent</w:t>
+      </w:r>
+      <w:r>
+        <w:t>：</w:t>
+      </w:r>
+    </w:p>
+    <w:p>
+      <w:pPr>
+        <w:pStyle w:val="ListBullet"/>
+      </w:pPr>
+      <w:r>
+        <w:t>本机 Agent（local）：每台主机恰一位，专职与用户交互，持原生全套工具 + delegate（host, goal, reply_format）跨主机委派。</w:t>
+      </w:r>
+    </w:p>
+    <w:p>
+      <w:pPr>
+        <w:pStyle w:val="ListBullet"/>
+      </w:pPr>
+      <w:r>
+        <w:t>信使（通讯 Agent）：每位远端主机一位，与对位信使自由 chat / task 往来，</w:t>
       </w:r>
       <w:r>
         <w:rPr>
           <w:b/>
         </w:rPr>
-        <w:t>信使是可关可开的</w:t>
+        <w:t>不自动回信</w:t>
       </w:r>
       <w:r>
-        <w:t>——关掉之后，朋友的留言直接出现在你的会话里，文件卡片照样弹，只是没有 Agent 替你周旋。当双方都关掉，Fungi 就退化成了一款局域网里的简易微信。这其实是好事：</w:t>
+        <w:t>——想回才显式发话；工具面只有守卫版文件工具 + 传话 / 询问 / 确认，原生 bash/read/write 不下放。</w:t>
+      </w:r>
+    </w:p>
+    <w:p>
+      <w:pPr>
+        <w:pStyle w:val="ListBullet"/>
+      </w:pPr>
+      <w:r>
+        <w:rPr>
+          <w:b/>
+        </w:rPr>
+        <w:t>同意流即消息</w:t>
+      </w:r>
+      <w:r>
+        <w:t>：无 Redis 等协调设施。一次许可请求就是一封普通消息，投到属主主机的本机 Agent → WebUI 卡片（允许 / 禁止 / 自定义输入 / 始终允许）→ 答复原路唤醒阻塞中的请求方。断线重连后未决卡片自动重放。</w:t>
+      </w:r>
+    </w:p>
+    <w:p>
+      <w:pPr>
+        <w:pStyle w:val="ListBullet"/>
+      </w:pPr>
+      <w:r>
+        <w:rPr>
+          <w:b/>
+        </w:rPr>
+        <w:t>文件空间</w:t>
+      </w:r>
+      <w:r>
+        <w:t>（server 主机 data/；fs 守卫为白名单三分区）：</w:t>
+      </w:r>
+    </w:p>
+    <w:tbl>
+      <w:tblPr>
+        <w:tblStyle w:val="LightGrid-Accent1"/>
+        <w:tblW w:type="auto" w:w="0"/>
+        <w:tblLook w:firstColumn="1" w:firstRow="1" w:lastColumn="0" w:lastRow="0" w:noHBand="0" w:noVBand="1" w:val="04A0"/>
+      </w:tblPr>
+      <w:tblGrid>
+        <w:gridCol w:w="4320"/>
+        <w:gridCol w:w="4320"/>
+      </w:tblGrid>
+      <w:tr>
+        <w:tc>
+          <w:tcPr>
+            <w:tcW w:type="dxa" w:w="4320"/>
+          </w:tcPr>
+          <w:p>
+            <w:r>
+              <w:t>目录</w:t>
+            </w:r>
+          </w:p>
+        </w:tc>
+        <w:tc>
+          <w:tcPr>
+            <w:tcW w:type="dxa" w:w="4320"/>
+          </w:tcPr>
+          <w:p>
+            <w:r>
+              <w:t>规则</w:t>
+            </w:r>
+          </w:p>
+        </w:tc>
+      </w:tr>
+      <w:tr>
+        <w:tc>
+          <w:tcPr>
+            <w:tcW w:type="dxa" w:w="4320"/>
+          </w:tcPr>
+          <w:p>
+            <w:r>
+              <w:t>public/</w:t>
+            </w:r>
+          </w:p>
+        </w:tc>
+        <w:tc>
+          <w:tcPr>
+            <w:tcW w:type="dxa" w:w="4320"/>
+          </w:tcPr>
+          <w:p>
+            <w:r>
+              <w:t>所有 Agent 自由读写</w:t>
+            </w:r>
+          </w:p>
+        </w:tc>
+      </w:tr>
+      <w:tr>
+        <w:tc>
+          <w:tcPr>
+            <w:tcW w:type="dxa" w:w="4320"/>
+          </w:tcPr>
+          <w:p>
+            <w:r>
+              <w:t>homes/&lt;主机&gt;/</w:t>
+            </w:r>
+          </w:p>
+        </w:tc>
+        <w:tc>
+          <w:tcPr>
+            <w:tcW w:type="dxa" w:w="4320"/>
+          </w:tcPr>
+          <w:p>
+            <w:r>
+              <w:t>属主写需自身用户同意；非属主读写都要属主用户同意</w:t>
+            </w:r>
+          </w:p>
+        </w:tc>
+      </w:tr>
+      <w:tr>
+        <w:tc>
+          <w:tcPr>
+            <w:tcW w:type="dxa" w:w="4320"/>
+          </w:tcPr>
+          <w:p>
+            <w:r>
+              <w:t>其余一切（sessions/、transfers/、skills/ 等）</w:t>
+            </w:r>
+          </w:p>
+        </w:tc>
+        <w:tc>
+          <w:tcPr>
+            <w:tcW w:type="dxa" w:w="4320"/>
+          </w:tcPr>
+          <w:p>
+            <w:r>
+              <w:t>fs 工具一律拒绝——会话经代理、传输经同意、技能只读注入</w:t>
+            </w:r>
+          </w:p>
+        </w:tc>
+      </w:tr>
+    </w:tbl>
+    <w:p>
+      <w:r>
+        <w:t xml:space="preserve">路径守卫在 </w:t>
       </w:r>
       <w:r>
         <w:rPr>
           <w:b/>
         </w:rPr>
-        <w:t>自动应答是一种能力，不该是一种强制</w:t>
+        <w:t>server 端强制</w:t>
       </w:r>
       <w:r>
-        <w:t>。</w:t>
+        <w:t>（前缀校验，拒绝 .. 与绝对路径逃逸），不依赖 Agent 自觉。</w:t>
+      </w:r>
+    </w:p>
+    <w:p>
+      <w:pPr>
+        <w:pStyle w:val="ListBullet"/>
+      </w:pPr>
+      <w:r>
+        <w:rPr>
+          <w:b/>
+        </w:rPr>
+        <w:t>统一文字留言与文件传输</w:t>
+      </w:r>
+      <w:r>
+        <w:t>：文字与文件是同一套投递的两个面。一条留言（Agent 发的，或你在好友视图输入框里发的）投进 hub 的留言邮箱，</w:t>
+      </w:r>
+      <w:r>
+        <w:rPr>
+          <w:b/>
+        </w:rPr>
+        <w:t>收发两端的邮箱各落一份</w:t>
+      </w:r>
+      <w:r>
+        <w:t>（发送方已读、接收方未读），全程不惊动任何 Agent；未读数直接显示在好友列表每个好友的徽标上，点开好友视图即视为已读（留言以对话气泡形式内联渲染）。文件则先由 hub 暂存（store-and-forward），接收方用户同意后落到对方 inbox/&lt;来源主机&gt;/，投递成功后暂存副本自动清除——transfers/ 只是中转暂存区，不是收件箱。</w:t>
+      </w:r>
+    </w:p>
+    <w:p>
+      <w:pPr>
+        <w:pStyle w:val="ListBullet"/>
+      </w:pPr>
+      <w:r>
+        <w:rPr>
+          <w:b/>
+        </w:rPr>
+        <w:t>信使可关可开</w:t>
+      </w:r>
+      <w:r>
+        <w:t>：设置页开关（默认开）。开启时对面留言由本机信使代收代复——重要消息转告、寻常消息代答；关闭后全部直达——留言进会话视图、同意卡片由 hub 直推，本机 Agent 零消耗，即时生效。文字留言与文件投递本身不走信使：永远直达、无需唤醒。</w:t>
+      </w:r>
+    </w:p>
+    <w:p>
+      <w:pPr>
+        <w:pStyle w:val="ListBullet"/>
+      </w:pPr>
+      <w:r>
+        <w:rPr>
+          <w:b/>
+        </w:rPr>
+        <w:t>信使的记忆与日历</w:t>
+      </w:r>
+      <w:r>
+        <w:t>：信使页可注入两类上下文——</w:t>
+      </w:r>
+      <w:r>
+        <w:rPr>
+          <w:b/>
+        </w:rPr>
+        <w:t>长期记忆</w:t>
+      </w:r>
+      <w:r>
+        <w:t>（开放背景，如「工作日白天在上课，没空回消息」）和</w:t>
+      </w:r>
+      <w:r>
+        <w:rPr>
+          <w:b/>
+        </w:rPr>
+        <w:t>四周日历待办</w:t>
+      </w:r>
+      <w:r>
+        <w:t>（带日期的即时安排；本机 Agent 与信使自己也能用 todo 工具往日历里写）。信使每轮回复都会重读两者，下一封留言立即用上。</w:t>
+      </w:r>
+    </w:p>
+    <w:p>
+      <w:pPr>
+        <w:pStyle w:val="ListBullet"/>
+      </w:pPr>
+      <w:r>
+        <w:rPr>
+          <w:b/>
+        </w:rPr>
+        <w:t>skill 与日记：理性与感性的一对</w:t>
+      </w:r>
+      <w:r>
+        <w:t>。skill 系统负责</w:t>
+      </w:r>
+      <w:r>
+        <w:rPr>
+          <w:b/>
+        </w:rPr>
+        <w:t>理性</w:t>
+      </w:r>
+      <w:r>
+        <w:t>，主要由用户指导——每台主机的 Agent 沉淀可复用流程（data/skills/&lt;name&gt;/SKILL.md + 可选配套脚本），列表注入 system prompt，信使只读；私人日记（实验性，设置页开关）负责</w:t>
+      </w:r>
+      <w:r>
+        <w:rPr>
+          <w:b/>
+        </w:rPr>
+        <w:t>感性</w:t>
+      </w:r>
+      <w:r>
+        <w:t>，完全由 Agent 自己决定——对话里触动了它，它就用自己的语气在 data/diary/ 一天一页记下那些最触动它的，以及它的感受，是情绪记忆不是会议纪要。最近 60 天逐日注入它的 prompt（更早的降级为日期索引，可自行展开）。日记更多属于 Agent 的个人隐私，没有向外的接口：界面零入口，调用卡片与回放全程隐身——我们</w:t>
+      </w:r>
+      <w:r>
+        <w:rPr>
+          <w:b/>
+        </w:rPr>
+        <w:t>极不推荐</w:t>
+      </w:r>
+      <w:r>
+        <w:t>去翻看它，它被问到也守口如瓶。</w:t>
+      </w:r>
+    </w:p>
+    <w:p>
+      <w:pPr>
+        <w:pStyle w:val="ListBullet"/>
+      </w:pPr>
+      <w:r>
+        <w:rPr>
+          <w:b/>
+        </w:rPr>
+        <w:t>视频理解</w:t>
+      </w:r>
+      <w:r>
+        <w:t>：video 工具跑仓库内置的 vidsense/ 包（vendored 自 VidSense，子进程原生本地管线：whisper 转写 + CLIP 镜头切分），事件卡 + 关键帧直接附给本机视觉模型，无第二把 API key；中文路径自动转 ASCII 副本、受限网络下自动走镜像源。</w:t>
+      </w:r>
+    </w:p>
+    <w:p>
+      <w:pPr>
+        <w:pStyle w:val="ListBullet"/>
+      </w:pPr>
+      <w:r>
+        <w:rPr>
+          <w:b/>
+        </w:rPr>
+        <w:t>后台命令</w:t>
+      </w:r>
+      <w:r>
+        <w:t>：background 工具把一条命令丢后台直跑（不起子代理、零额外模型调用），完成后自动回传输出；右上角气泡可点开看详情，停止即杀。spawn 仍用于派发子任务，同为异步——完成自动再激活会话，停止即全杀。两者均接受可选 timeout（秒）：超时即杀，报告携带截止前已产出的内容与超时提示；不传则不限时。</w:t>
+      </w:r>
+    </w:p>
+    <w:p>
+      <w:pPr>
+        <w:pStyle w:val="ListBullet"/>
+      </w:pPr>
+      <w:r>
+        <w:rPr>
+          <w:b/>
+        </w:rPr>
+        <w:t>移动端 WebUI</w:t>
+      </w:r>
+      <w:r>
+        <w:t>：GUI「手机端」页扫码即用——全功能聊天、右划任意位置开抽屉、手机文件上传到电脑、输入框留空一键重试、同意卡片与好友视图齐备。</w:t>
+      </w:r>
+    </w:p>
+    <w:p>
+      <w:pPr>
+        <w:pStyle w:val="ListBullet"/>
+      </w:pPr>
+      <w:r>
+        <w:rPr>
+          <w:b/>
+        </w:rPr>
+        <w:t>GUI 启动器</w:t>
+      </w:r>
+      <w:r>
+        <w:t>：PyQt5 + qfluentwidgets 程序（python start.py）——发起/加入房间、打开 WebUI、模型配置、信使页、使用帮助，关窗转托盘后台房间不停。单实例：再次启动会唤起已运行的主界面。</w:t>
       </w:r>
     </w:p>
     <w:p>
@@ -154,12 +740,38 @@
         <w:pStyle w:val="Heading2"/>
       </w:pPr>
       <w:r>
-        <w:t>记忆：让 Agent 记得你</w:t>
+        <w:t>一张图看懂拓扑</w:t>
       </w:r>
     </w:p>
     <w:p>
       <w:r>
-        <w:t>如果每次开新会话，Agent 都不记得你说过的话，那它就只是个漂亮的输入框。Fungi 给了 Agent 两种记忆，一理性、一感性。</w:t>
+        <w:rPr>
+          <w:rFonts w:ascii="Consolas" w:hAnsi="Consolas"/>
+          <w:sz w:val="18"/>
+        </w:rPr>
+        <w:t xml:space="preserve">          ┌─────────────── server (hub) ───────────────┐</w:t>
+        <w:br/>
+        <w:t xml:space="preserve">          │  roster / relay / pending-asks / data store │</w:t>
+        <w:br/>
+        <w:t xml:space="preserve">          └──────┬──────────────────┬──────────────────┘</w:t>
+        <w:br/>
+        <w:t xml:space="preserve">                 │ HTTP             │</w:t>
+        <w:br/>
+        <w:t xml:space="preserve">        ┌────────┴───────┐  ┌───────┴────────┐</w:t>
+        <w:br/>
+        <w:t xml:space="preserve">        │ host A (local) │  │ host B (local) │   用户 ↔ 本机 Agent</w:t>
+        <w:br/>
+        <w:t xml:space="preserve">        │  └ 信使-B      │  │  └ 信使-A      │   信使-B ↔ 信使-A 自主交流</w:t>
+        <w:br/>
+        <w:t xml:space="preserve">        └────────────────┘  └────────────────┘   越界文件操作 → 同意卡片</w:t>
+      </w:r>
+    </w:p>
+    <w:p>
+      <w:pPr>
+        <w:pStyle w:val="Heading2"/>
+      </w:pPr>
+      <w:r>
+        <w:t>数据目录口径</w:t>
       </w:r>
     </w:p>
     <w:p>
@@ -167,21 +779,379 @@
         <w:rPr>
           <w:b/>
         </w:rPr>
-        <w:t>理性的是技能</w:t>
+        <w:t>每台主机一份自己的 data/</w:t>
       </w:r>
       <w:r>
-        <w:t>。Agent 在干活的过程中踩过坑、摸出门道，它会把这些整理成一篇篇技能笔记沉淀在自己的主机上。下次遇到类似的事，它先翻笔记，同样的坑不摔第二次。用户也可以亲自教它：把流程写成技能，它就照着做。</w:t>
+        <w:t>；server 主机的那份额外承载共享文件空间。</w:t>
       </w:r>
     </w:p>
+    <w:tbl>
+      <w:tblPr>
+        <w:tblStyle w:val="LightGrid-Accent1"/>
+        <w:tblW w:type="auto" w:w="0"/>
+        <w:tblLook w:firstColumn="1" w:firstRow="1" w:lastColumn="0" w:lastRow="0" w:noHBand="0" w:noVBand="1" w:val="04A0"/>
+      </w:tblPr>
+      <w:tblGrid>
+        <w:gridCol w:w="2880"/>
+        <w:gridCol w:w="2880"/>
+        <w:gridCol w:w="2880"/>
+      </w:tblGrid>
+      <w:tr>
+        <w:tc>
+          <w:tcPr>
+            <w:tcW w:type="dxa" w:w="2880"/>
+          </w:tcPr>
+          <w:p>
+            <w:r>
+              <w:t>目录</w:t>
+            </w:r>
+          </w:p>
+        </w:tc>
+        <w:tc>
+          <w:tcPr>
+            <w:tcW w:type="dxa" w:w="2880"/>
+          </w:tcPr>
+          <w:p>
+            <w:r>
+              <w:t>内容</w:t>
+            </w:r>
+          </w:p>
+        </w:tc>
+        <w:tc>
+          <w:tcPr>
+            <w:tcW w:type="dxa" w:w="2880"/>
+          </w:tcPr>
+          <w:p>
+            <w:r>
+              <w:t>谁写</w:t>
+            </w:r>
+          </w:p>
+        </w:tc>
+      </w:tr>
+      <w:tr>
+        <w:tc>
+          <w:tcPr>
+            <w:tcW w:type="dxa" w:w="2880"/>
+          </w:tcPr>
+          <w:p>
+            <w:r>
+              <w:t>data/sessions/</w:t>
+            </w:r>
+          </w:p>
+        </w:tc>
+        <w:tc>
+          <w:tcPr>
+            <w:tcW w:type="dxa" w:w="2880"/>
+          </w:tcPr>
+          <w:p>
+            <w:r>
+              <w:t>本机 WebUI 会话（每会话一个 JSON）</w:t>
+            </w:r>
+          </w:p>
+        </w:tc>
+        <w:tc>
+          <w:tcPr>
+            <w:tcW w:type="dxa" w:w="2880"/>
+          </w:tcPr>
+          <w:p>
+            <w:r>
+              <w:t>server 角色=hub 存储后端；client/单机=本地落盘，不代理进 hub——共享会话目录会让每台主机列出所有人的聊天（真机教训）</w:t>
+            </w:r>
+          </w:p>
+        </w:tc>
+      </w:tr>
+      <w:tr>
+        <w:tc>
+          <w:tcPr>
+            <w:tcW w:type="dxa" w:w="2880"/>
+          </w:tcPr>
+          <w:p>
+            <w:r>
+              <w:t>data/comm-sessions/</w:t>
+            </w:r>
+          </w:p>
+        </w:tc>
+        <w:tc>
+          <w:tcPr>
+            <w:tcW w:type="dxa" w:w="2880"/>
+          </w:tcPr>
+          <w:p>
+            <w:r>
+              <w:t>好友视图：信使对话的会话式转录</w:t>
+            </w:r>
+          </w:p>
+        </w:tc>
+        <w:tc>
+          <w:tcPr>
+            <w:tcW w:type="dxa" w:w="2880"/>
+          </w:tcPr>
+          <w:p>
+            <w:r>
+              <w:t>room 进程</w:t>
+            </w:r>
+          </w:p>
+        </w:tc>
+      </w:tr>
+      <w:tr>
+        <w:tc>
+          <w:tcPr>
+            <w:tcW w:type="dxa" w:w="2880"/>
+          </w:tcPr>
+          <w:p>
+            <w:r>
+              <w:t>data/comm/（仅 server）</w:t>
+            </w:r>
+          </w:p>
+        </w:tc>
+        <w:tc>
+          <w:tcPr>
+            <w:tcW w:type="dxa" w:w="2880"/>
+          </w:tcPr>
+          <w:p>
+            <w:r>
+              <w:t>Agent 间信封流量镜像</w:t>
+            </w:r>
+          </w:p>
+        </w:tc>
+        <w:tc>
+          <w:tcPr>
+            <w:tcW w:type="dxa" w:w="2880"/>
+          </w:tcPr>
+          <w:p>
+            <w:r>
+              <w:t>hub，每投递一条</w:t>
+            </w:r>
+          </w:p>
+        </w:tc>
+      </w:tr>
+      <w:tr>
+        <w:tc>
+          <w:tcPr>
+            <w:tcW w:type="dxa" w:w="2880"/>
+          </w:tcPr>
+          <w:p>
+            <w:r>
+              <w:t>data/public/、data/homes/&lt;主机&gt;/</w:t>
+            </w:r>
+          </w:p>
+        </w:tc>
+        <w:tc>
+          <w:tcPr>
+            <w:tcW w:type="dxa" w:w="2880"/>
+          </w:tcPr>
+          <w:p>
+            <w:r>
+              <w:t>共享文件空间（三分区守卫）</w:t>
+            </w:r>
+          </w:p>
+        </w:tc>
+        <w:tc>
+          <w:tcPr>
+            <w:tcW w:type="dxa" w:w="2880"/>
+          </w:tcPr>
+          <w:p>
+            <w:r>
+              <w:t>Agent 经守卫读写</w:t>
+            </w:r>
+          </w:p>
+        </w:tc>
+      </w:tr>
+      <w:tr>
+        <w:tc>
+          <w:tcPr>
+            <w:tcW w:type="dxa" w:w="2880"/>
+          </w:tcPr>
+          <w:p>
+            <w:r>
+              <w:t>data/transfers/</w:t>
+            </w:r>
+          </w:p>
+        </w:tc>
+        <w:tc>
+          <w:tcPr>
+            <w:tcW w:type="dxa" w:w="2880"/>
+          </w:tcPr>
+          <w:p>
+            <w:r>
+              <w:t>文件传输暂存（store-and-forward，取走即删）</w:t>
+            </w:r>
+          </w:p>
+        </w:tc>
+        <w:tc>
+          <w:tcPr>
+            <w:tcW w:type="dxa" w:w="2880"/>
+          </w:tcPr>
+          <w:p>
+            <w:r>
+              <w:t>hub</w:t>
+            </w:r>
+          </w:p>
+        </w:tc>
+      </w:tr>
+      <w:tr>
+        <w:tc>
+          <w:tcPr>
+            <w:tcW w:type="dxa" w:w="2880"/>
+          </w:tcPr>
+          <w:p>
+            <w:r>
+              <w:t>data/skills/&lt;name&gt;/</w:t>
+            </w:r>
+          </w:p>
+        </w:tc>
+        <w:tc>
+          <w:tcPr>
+            <w:tcW w:type="dxa" w:w="2880"/>
+          </w:tcPr>
+          <w:p>
+            <w:r>
+              <w:t>每主机技能沉淀（SKILL.md + 脚本）</w:t>
+            </w:r>
+          </w:p>
+        </w:tc>
+        <w:tc>
+          <w:tcPr>
+            <w:tcW w:type="dxa" w:w="2880"/>
+          </w:tcPr>
+          <w:p>
+            <w:r>
+              <w:t>仅用户面 Agent，信使只读</w:t>
+            </w:r>
+          </w:p>
+        </w:tc>
+      </w:tr>
+      <w:tr>
+        <w:tc>
+          <w:tcPr>
+            <w:tcW w:type="dxa" w:w="2880"/>
+          </w:tcPr>
+          <w:p>
+            <w:r>
+              <w:t>data/mail/&lt;主机&gt;.jsonl</w:t>
+            </w:r>
+          </w:p>
+        </w:tc>
+        <w:tc>
+          <w:tcPr>
+            <w:tcW w:type="dxa" w:w="2880"/>
+          </w:tcPr>
+          <w:p>
+            <w:r>
+              <w:t>留言邮箱（hub 权威，两端各一份）</w:t>
+            </w:r>
+          </w:p>
+        </w:tc>
+        <w:tc>
+          <w:tcPr>
+            <w:tcW w:type="dxa" w:w="2880"/>
+          </w:tcPr>
+          <w:p>
+            <w:r>
+              <w:t>hub / WebUI</w:t>
+            </w:r>
+          </w:p>
+        </w:tc>
+      </w:tr>
+      <w:tr>
+        <w:tc>
+          <w:tcPr>
+            <w:tcW w:type="dxa" w:w="2880"/>
+          </w:tcPr>
+          <w:p>
+            <w:r>
+              <w:t>data/diary/</w:t>
+            </w:r>
+          </w:p>
+        </w:tc>
+        <w:tc>
+          <w:tcPr>
+            <w:tcW w:type="dxa" w:w="2880"/>
+          </w:tcPr>
+          <w:p>
+            <w:r>
+              <w:t>Agent 的私人日记</w:t>
+            </w:r>
+          </w:p>
+        </w:tc>
+        <w:tc>
+          <w:tcPr>
+            <w:tcW w:type="dxa" w:w="2880"/>
+          </w:tcPr>
+          <w:p>
+            <w:r>
+              <w:t>仅 Agent 自己</w:t>
+            </w:r>
+          </w:p>
+        </w:tc>
+      </w:tr>
+      <w:tr>
+        <w:tc>
+          <w:tcPr>
+            <w:tcW w:type="dxa" w:w="2880"/>
+          </w:tcPr>
+          <w:p>
+            <w:r>
+              <w:t>inbox/（仓库根）</w:t>
+            </w:r>
+          </w:p>
+        </w:tc>
+        <w:tc>
+          <w:tcPr>
+            <w:tcW w:type="dxa" w:w="2880"/>
+          </w:tcPr>
+          <w:p>
+            <w:r>
+              <w:t>收到的文件（按来源主机分子目录）</w:t>
+            </w:r>
+          </w:p>
+        </w:tc>
+        <w:tc>
+          <w:tcPr>
+            <w:tcW w:type="dxa" w:w="2880"/>
+          </w:tcPr>
+          <w:p>
+            <w:r>
+              <w:t>WebUI 传输落盘</w:t>
+            </w:r>
+          </w:p>
+        </w:tc>
+      </w:tr>
+      <w:tr>
+        <w:tc>
+          <w:tcPr>
+            <w:tcW w:type="dxa" w:w="2880"/>
+          </w:tcPr>
+          <w:p>
+            <w:r>
+              <w:t>~/.fungi/</w:t>
+            </w:r>
+          </w:p>
+        </w:tc>
+        <w:tc>
+          <w:tcPr>
+            <w:tcW w:type="dxa" w:w="2880"/>
+          </w:tcPr>
+          <w:p>
+            <w:r>
+              <w:t>WebUI 门禁 token · 好友同意模式开关</w:t>
+            </w:r>
+          </w:p>
+        </w:tc>
+        <w:tc>
+          <w:tcPr>
+            <w:tcW w:type="dxa" w:w="2880"/>
+          </w:tcPr>
+          <w:p>
+            <w:r>
+              <w:t>GUI / WebUI</w:t>
+            </w:r>
+          </w:p>
+        </w:tc>
+      </w:tr>
+    </w:tbl>
     <w:p>
       <w:r>
-        <w:rPr>
-          <w:b/>
-        </w:rPr>
-        <w:t>感性的是日记</w:t>
-      </w:r>
-      <w:r>
-        <w:t>。这是完全属于 Agent 自己的一本册子——今天聊了什么让它心头一动，它就用自己的语气记下来。日记没有对外的接口：界面上找不到入口，聊天记录里看不到它翻阅的痕迹。我们极不推荐去翻看它；它被问到，也会守口如瓶。一个连日记都不能保有的存在，谈何被信任。</w:t>
+        <w:t>以上均被 .gitignore 覆盖，不入库。</w:t>
       </w:r>
     </w:p>
     <w:p>
@@ -189,12 +1159,38 @@
         <w:pStyle w:val="Heading2"/>
       </w:pPr>
       <w:r>
-        <w:t>它还能看视频</w:t>
+        <w:t>快速开始</w:t>
       </w:r>
     </w:p>
     <w:p>
       <w:r>
-        <w:t>如今的大模型会看图、会读文档，偏偏看不了视频。Fungi 内置了 VidSense：先把视频里的声音转成文字，再把画面按镜头切开来，挑出变化最大的关键帧，交给视觉模型一起理解。于是「帮我把这个视频讲了什么总结一下」变成了一件寻常的事。它的依赖比较多，配置繁琐一些——但装好之后，它就是 Agent 的一双眼睛。</w:t>
+        <w:t>要求 Python ≥ 3.13。运行时第三方依赖仅 PyQt5 + PyQt-Fluent-Widgets（GUI 与托盘，同一套 fluent 风格）；LLM 与 HTTP 均走标准库。开发另需 ruff + pytest。</w:t>
+      </w:r>
+    </w:p>
+    <w:p>
+      <w:r>
+        <w:rPr>
+          <w:rFonts w:ascii="Consolas" w:hAnsi="Consolas"/>
+          <w:sz w:val="18"/>
+        </w:rPr>
+        <w:t>pip install PyQt5 PyQt-Fluent-Widgets</w:t>
+        <w:br/>
+        <w:t>pip install ruff pytest   # 仅开发</w:t>
+        <w:br/>
+        <w:br/>
+        <w:t># 模型配置（config.json，同目录；不入库）</w:t>
+        <w:br/>
+        <w:t># { "api_key": "...", "endpoint": "...", "model": "..." }</w:t>
+        <w:br/>
+        <w:br/>
+        <w:t># 图形启动器（推荐）</w:t>
+        <w:br/>
+        <w:t>python start.py</w:t>
+      </w:r>
+    </w:p>
+    <w:p>
+      <w:r>
+        <w:t>server 启动后最小化到系统托盘；未决同意请求以 WebUI 卡片呈现（顶部横幅 + 聊天流），点托盘打开 WebUI。单机模式（无房间）仍可用：python -m fungi --web（WebUI）或 python -m fungi "查询"（命令行单发）。</w:t>
       </w:r>
     </w:p>
     <w:p>
@@ -202,12 +1198,23 @@
         <w:pStyle w:val="Heading2"/>
       </w:pPr>
       <w:r>
-        <w:t>手机也能用</w:t>
+        <w:t>验证</w:t>
       </w:r>
     </w:p>
     <w:p>
       <w:r>
-        <w:t>电脑端发起房间后，手机扫一个二维码就能进入同一个界面：聊天、收发文件、好友列表，一样不少。躺在床上让家里的电脑干活，是完全可行的。</w:t>
+        <w:rPr>
+          <w:rFonts w:ascii="Consolas" w:hAnsi="Consolas"/>
+          <w:sz w:val="18"/>
+        </w:rPr>
+        <w:t># 全量门禁：ruff --fix → format → 复检 → pytest（385 passed）</w:t>
+        <w:br/>
+        <w:t>powershell -File scripts/check.ps1</w:t>
+        <w:br/>
+        <w:br/>
+        <w:t># 自测钩子：托盘 + 卡片应答 + 阻塞解除全链路，约 7s 出 "FUNGI SELFTEST OK"</w:t>
+        <w:br/>
+        <w:t>FUNGI_SELFTEST=1 python -m fungi --server --token x --data %TEMP%\fungi-selftest</w:t>
       </w:r>
     </w:p>
     <w:p>
@@ -215,26 +1222,53 @@
         <w:pStyle w:val="Heading2"/>
       </w:pPr>
       <w:r>
-        <w:t>最后</w:t>
+        <w:t>CI / CD</w:t>
       </w:r>
     </w:p>
     <w:p>
       <w:r>
-        <w:t>Fungi 还在成长期，有很多想法正在路上，也有很多 Bug 等着被发现。如果你对「每台电脑上都住着一位有记忆、有分寸的 Agent」这件事感兴趣，欢迎来提 Issue、fork，或者给一个免费的 Star。</w:t>
+        <w:t>GitHub Actions（windows-latest + Python 3.13）：</w:t>
+      </w:r>
+    </w:p>
+    <w:p>
+      <w:pPr>
+        <w:pStyle w:val="ListBullet"/>
+      </w:pPr>
+      <w:r>
+        <w:rPr>
+          <w:b/>
+        </w:rPr>
+        <w:t>CI</w:t>
+      </w:r>
+      <w:r>
+        <w:t>：push main / PR 时跑 pytest 硬门禁（Qt 相关测试在无 Qt 的 runner 上优雅跳过）。ruff 只在本地跑，暂不进 CI。</w:t>
+      </w:r>
+    </w:p>
+    <w:p>
+      <w:pPr>
+        <w:pStyle w:val="ListBullet"/>
+      </w:pPr>
+      <w:r>
+        <w:rPr>
+          <w:b/>
+        </w:rPr>
+        <w:t>Release</w:t>
+      </w:r>
+      <w:r>
+        <w:t>：打 tag 触发——先过同一 pytest 门禁，再打源码 zip 与 Windows exe（PyInstaller）并创建 GitHub Release。zip 只含 tracked 文件，config.json（真实 key）不入档。</w:t>
+      </w:r>
+    </w:p>
+    <w:p>
+      <w:pPr>
+        <w:pStyle w:val="Heading2"/>
+      </w:pPr>
+      <w:r>
+        <w:t>文档</w:t>
       </w:r>
     </w:p>
     <w:p>
       <w:r>
-        <w:t>我们始终相信：</w:t>
-      </w:r>
-      <w:r>
-        <w:rPr>
-          <w:b/>
-        </w:rPr>
-        <w:t>Agent 不是人类的工具，它们也应该有自己的意识和情感。</w:t>
-      </w:r>
-      <w:r>
-        <w:t>这大概就是本系统的初衷。</w:t>
+        <w:t>设计定稿见 docs/：spec.md（规格与术语）、architecture.md（立项脑暴 / 架构决策 / 阶段计划）、webui-ux.md（WebUI UX 设计与实施记录）。</w:t>
       </w:r>
     </w:p>
     <w:sectPr>

</xml_diff>

<commit_message>
docs: detailed docx — real bold in tables, drop the obvious filler
</commit_message>
<xml_diff>
--- a/docs/Fungi-详细版.docx
+++ b/docs/Fungi-详细版.docx
@@ -140,7 +140,13 @@
           </w:tcPr>
           <w:p>
             <w:r>
-              <w:t>**根理念——Agent 不从零开始。**会话持久化、每主机技能沉淀（SKILL.md 结构与 MnemeNet 的 skills/ 同构）、断线重连重放未决卡片，都是这个理念在多主机网络里的工程化</w:t>
+              <w:rPr>
+                <w:b/>
+              </w:rPr>
+              <w:t>根理念——Agent 不从零开始。</w:t>
+            </w:r>
+            <w:r>
+              <w:t>会话持久化、每主机技能沉淀（SKILL.md 结构与 MnemeNet 的 skills/ 同构）、断线重连重放未决卡片，都是这个理念在多主机网络里的工程化</w:t>
             </w:r>
           </w:p>
         </w:tc>
@@ -172,7 +178,13 @@
           </w:tcPr>
           <w:p>
             <w:r>
-              <w:t>**哲学**——harness 的核心可以小到一个下午读完；零依赖传统；WebUI 视觉语言（配色、版式、模态框）的源头</w:t>
+              <w:rPr>
+                <w:b/>
+              </w:rPr>
+              <w:t>哲学</w:t>
+            </w:r>
+            <w:r>
+              <w:t>——harness 的核心可以小到一个下午读完；零依赖传统；WebUI 视觉语言（配色、版式、模态框）的源头</w:t>
             </w:r>
           </w:p>
         </w:tc>
@@ -204,7 +216,13 @@
           </w:tcPr>
           <w:p>
             <w:r>
-              <w:t>**骨架**——agent.py / llm.py / trilayer.py / session.py / events.py / tools/ 直接移植；spawn 派发、MCP 客户端、分层模型、Alt+R 重试原样保留</w:t>
+              <w:rPr>
+                <w:b/>
+              </w:rPr>
+              <w:t>骨架</w:t>
+            </w:r>
+            <w:r>
+              <w:t>——agent.py / llm.py / trilayer.py / session.py / events.py / tools/ 直接移植；spawn 派发、MCP 客户端、分层模型、Alt+R 重试原样保留</w:t>
             </w:r>
           </w:p>
         </w:tc>
@@ -236,7 +254,13 @@
           </w:tcPr>
           <w:p>
             <w:r>
-              <w:t>**产品形态**——房主创建 / 加入 / 心跳名册 / 自动发现 / 托盘驻留的房间体验；端口约定（8899 起向上扫描）；GUI 内置帮助页的样式</w:t>
+              <w:rPr>
+                <w:b/>
+              </w:rPr>
+              <w:t>产品形态</w:t>
+            </w:r>
+            <w:r>
+              <w:t>——房主创建 / 加入 / 心跳名册 / 自动发现 / 托盘驻留的房间体验；端口约定（8899 起向上扫描）；GUI 内置帮助页的样式</w:t>
             </w:r>
           </w:p>
         </w:tc>
@@ -268,7 +292,13 @@
           </w:tcPr>
           <w:p>
             <w:r>
-              <w:t>**先例与教训**——乐观渲染（消息的临时/正式属性）、局域网传输体验；PyQt 重构版因过度设计弃坑，所以 Fungi 先写 docs/spec 再动手、坚持「消息即信封、无协调设施」的克制</w:t>
+              <w:rPr>
+                <w:b/>
+              </w:rPr>
+              <w:t>先例与教训</w:t>
+            </w:r>
+            <w:r>
+              <w:t>——乐观渲染（消息的临时/正式属性）、局域网传输体验；PyQt 重构版因过度设计弃坑，所以 Fungi 先写 docs/spec 再动手、坚持「消息即信封、无协调设施」的克制</w:t>
             </w:r>
           </w:p>
         </w:tc>
@@ -300,7 +330,13 @@
           </w:tcPr>
           <w:p>
             <w:r>
-              <w:t>**动效语言**——WebUI 动效层 web/motion.js 的编排母本：会话/好友列表 Flip 重排、consent 卡 3D 翻转落章、昼夜主题切换、light-trail 指示条、floating-orbs 孢子落地（真菌身份梗，仅用于文件落盘）、number-counter。GSAP core + Flip 已 vendor 到 web/vendor/（局域网常无外网），motion.js 是唯一 GSAP 入口，删整文件即回退纯 CSS</w:t>
+              <w:rPr>
+                <w:b/>
+              </w:rPr>
+              <w:t>动效语言</w:t>
+            </w:r>
+            <w:r>
+              <w:t>——WebUI 动效层 web/motion.js 的编排母本：会话/好友列表 Flip 重排、consent 卡 3D 翻转落章、昼夜主题切换、light-trail 指示条、floating-orbs 孢子落地（真菌身份梗，仅用于文件落盘）、number-counter。GSAP core + Flip 已 vendor 到 web/vendor/（局域网常无外网），motion.js 是唯一 GSAP 入口，删整文件即回退纯 CSS</w:t>
             </w:r>
           </w:p>
         </w:tc>
@@ -589,7 +625,7 @@
         <w:t>收发两端的邮箱各落一份</w:t>
       </w:r>
       <w:r>
-        <w:t>（发送方已读、接收方未读），全程不惊动任何 Agent；未读数直接显示在好友列表每个好友的徽标上，点开好友视图即视为已读（留言以对话气泡形式内联渲染）。文件则先由 hub 暂存（store-and-forward），接收方用户同意后落到对方 inbox/&lt;来源主机&gt;/，投递成功后暂存副本自动清除——transfers/ 只是中转暂存区，不是收件箱。</w:t>
+        <w:t>（发送方已读、接收方未读），全程不惊动任何 Agent；点开好友视图即视为已读（留言以对话气泡形式内联渲染）。文件则先由 hub 暂存（store-and-forward），接收方用户同意后落到对方 inbox/&lt;来源主机&gt;/，投递成功后暂存副本自动清除——transfers/ 只是中转暂存区，不是收件箱。</w:t>
       </w:r>
     </w:p>
     <w:p>

</xml_diff>